<commit_message>
Re-run analysis: 56 in-scope (Olympic Dam reclassified), corrected required-flag rule, 966 rows verified verbatim
</commit_message>
<xml_diff>
--- a/analysis/output/jd_analysis.docx
+++ b/analysis/output/jd_analysis.docx
@@ -15,7 +15,7 @@
         <w:pStyle w:val="Subtitle"/>
       </w:pPr>
       <w:r>
-        <w:t xml:space="preserve">Job Description Analysis: content analysis of 57 job descriptions across coal, minerals and quarry sectors</w:t>
+        <w:t xml:space="preserve">Job Description Analysis: content analysis of 56 job descriptions across coal, minerals and quarry sectors</w:t>
       </w:r>
     </w:p>
     <w:p>
@@ -23,7 +23,7 @@
         <w:pStyle w:val="Author"/>
       </w:pPr>
       <w:r>
-        <w:t xml:space="preserve">Brooklyn Corbett</w:t>
+        <w:t>Analysis by Brooklyn Corbett (UQ)</w:t>
       </w:r>
     </w:p>
     <w:p>
@@ -31,39 +31,39 @@
         <w:pStyle w:val="Date"/>
       </w:pPr>
       <w:r>
-        <w:t xml:space="preserve">2026-05-19</w:t>
+        <w:t xml:space="preserve">2026-05-20</w:t>
       </w:r>
     </w:p>
-    <w:sdt>
-      <w:sdtPr>
-        <w:docPartObj>
-          <w:docPartGallery w:val="Table of Contents"/>
-          <w:docPartUnique/>
-        </w:docPartObj>
-      </w:sdtPr>
-      <w:sdtContent>
-        <w:p>
-          <w:pPr>
-            <w:pStyle w:val="TOCHeading"/>
-          </w:pPr>
-          <w:r>
-            <w:t xml:space="preserve">Table of contents</w:t>
-          </w:r>
-        </w:p>
-        <w:p>
-          <w:r>
-            <w:fldChar w:fldCharType="begin" w:dirty="true"/>
-            <w:instrText xml:space="preserve">TOC \o "1-2" \h \z \u</w:instrText>
-            <w:fldChar w:fldCharType="separate"/>
-            <w:fldChar w:fldCharType="end"/>
-          </w:r>
-        </w:p>
-      </w:sdtContent>
-    </w:sdt>
     <w:bookmarkStart w:id="19" w:name="executive-summary"/>
     <w:p>
       <w:pPr>
         <w:pStyle w:val="Heading1"/>
+      </w:pPr>
+      <w:r>
+        <w:t>Table of contents</w:t>
+      </w:r>
+    </w:p>
+    <w:p>
+      <w:r>
+        <w:fldChar w:fldCharType="begin" w:dirty="true"/>
+      </w:r>
+      <w:r>
+        <w:instrText xml:space="preserve"> TOC \o "1-2" \h \z \u </w:instrText>
+      </w:r>
+      <w:r>
+        <w:fldChar w:fldCharType="separate"/>
+      </w:r>
+      <w:r>
+        <w:t>Right-click here and choose "Update Field" to generate the table of contents.</w:t>
+      </w:r>
+      <w:r>
+        <w:fldChar w:fldCharType="end"/>
+      </w:r>
+    </w:p>
+    <w:p>
+      <w:pPr>
+        <w:pStyle w:val="Heading1"/>
+        <w:pageBreakBefore/>
       </w:pPr>
       <w:r>
         <w:t xml:space="preserve">1. Executive summary</w:t>
@@ -84,7 +84,7 @@
           <w:b/>
           <w:bCs/>
         </w:rPr>
-        <w:t xml:space="preserve">57 job descriptions</w:t>
+        <w:t xml:space="preserve">56 job descriptions</w:t>
       </w:r>
       <w:r>
         <w:t xml:space="preserve"> </w:t>
@@ -127,7 +127,7 @@
         </w:numPr>
       </w:pPr>
       <w:r>
-        <w:t xml:space="preserve">The most-named single expectation in the corpus is supervisory experience (E1), which appears in 43 of 57 JDs (75%).</w:t>
+        <w:t xml:space="preserve">The most-named single expectation in the corpus is supervisory experience (E1), which appears in 46 of 56 JDs (82%).</w:t>
       </w:r>
     </w:p>
     <w:p>
@@ -139,7 +139,7 @@
         </w:numPr>
       </w:pPr>
       <w:r>
-        <w:t xml:space="preserve">The three most-named duties are: supervise and lead crews/contractors (D1) in 34 JDs (60%), promote and uphold safety culture (D6) in 30 JDs (53%), and coach, mentor and develop team capability (D2) in 28 JDs (49%).</w:t>
+        <w:t xml:space="preserve">The three most-named duties are: supervise and lead crews/contractors (D1) in 39 JDs (70%), coach, mentor and develop team capability (D2) in 31 JDs (55%), and oversee daily operations (D7) in 30 JDs (54%).</w:t>
       </w:r>
     </w:p>
     <w:p>
@@ -151,7 +151,7 @@
         </w:numPr>
       </w:pPr>
       <w:r>
-        <w:t xml:space="preserve">The most-named disposition is strong communicator (DP2), appearing in 31 JDs (54%).</w:t>
+        <w:t xml:space="preserve">The most-named disposition is strong communicator (DP2), appearing in 28 JDs (50%).</w:t>
       </w:r>
     </w:p>
     <w:p>
@@ -163,7 +163,7 @@
         </w:numPr>
       </w:pPr>
       <w:r>
-        <w:t xml:space="preserve">The most-named formal qualification is a driver’s licence (Q11), appearing in 18 JDs (31%); the next most common are trade qualification (Q9) in 17 JDs (29%) and Standard 11 (Q1) in 12 JDs (20%).</w:t>
+        <w:t xml:space="preserve">The most-named formal qualification is a driver’s licence (Q11), appearing in 18 JDs (32%); the next most common are trade qualification (Q9) in 17 JDs (30%) and Coal Surface supervisor competencies (Q2) in 15 JDs (27%).</w:t>
       </w:r>
     </w:p>
     <w:p>
@@ -175,7 +175,7 @@
         </w:numPr>
       </w:pPr>
       <w:r>
-        <w:t xml:space="preserve">51 of 57 JDs (89%) contain at least one of the four safety-related codes (D4, D5, D6, DP1).</w:t>
+        <w:t xml:space="preserve">53 of 56 JDs (95%) contain at least one of the four safety-related codes (D4, D5, D6, DP1).</w:t>
       </w:r>
     </w:p>
     <w:p>
@@ -187,7 +187,7 @@
         </w:numPr>
       </w:pPr>
       <w:r>
-        <w:t xml:space="preserve">Statutory positions are explicitly named in only 4 of 57 JDs: Open Cut Examiner (2 JDs), Statutory Underground Shift Supervisor (1 JD), and Shotfirer (1 JD). The remaining 53 JDs require statutory tickets without explicitly being statutory positions.</w:t>
+        <w:t xml:space="preserve">Statutory positions are explicitly named in only 1 of 56 JDs: Open Cut Examiner appointed at Golding OCE Kogan. The remaining 55 JDs require statutory tickets without explicitly being statutory positions.</w:t>
       </w:r>
     </w:p>
     <w:bookmarkEnd w:id="19"/>
@@ -342,7 +342,7 @@
                     <w:jc w:val="center"/>
                   </w:pPr>
                   <w:r>
-                    <w:t xml:space="preserve">50.9</w:t>
+                    <w:t xml:space="preserve">51.8</w:t>
                   </w:r>
                 </w:p>
               </w:tc>
@@ -383,7 +383,7 @@
                     <w:jc w:val="center"/>
                   </w:pPr>
                   <w:r>
-                    <w:t xml:space="preserve">5.3</w:t>
+                    <w:t xml:space="preserve">5.4</w:t>
                   </w:r>
                 </w:p>
               </w:tc>
@@ -424,7 +424,7 @@
                     <w:jc w:val="center"/>
                   </w:pPr>
                   <w:r>
-                    <w:t xml:space="preserve">21.1</w:t>
+                    <w:t xml:space="preserve">21.4</w:t>
                   </w:r>
                 </w:p>
               </w:tc>
@@ -452,7 +452,7 @@
                     <w:jc w:val="center"/>
                   </w:pPr>
                   <w:r>
-                    <w:t xml:space="preserve">6</w:t>
+                    <w:t xml:space="preserve">5</w:t>
                   </w:r>
                 </w:p>
               </w:tc>
@@ -465,7 +465,7 @@
                     <w:jc w:val="center"/>
                   </w:pPr>
                   <w:r>
-                    <w:t xml:space="preserve">10.5</w:t>
+                    <w:t xml:space="preserve">8.9</w:t>
                   </w:r>
                 </w:p>
               </w:tc>
@@ -506,7 +506,7 @@
                     <w:jc w:val="center"/>
                   </w:pPr>
                   <w:r>
-                    <w:t xml:space="preserve">12.3</w:t>
+                    <w:t xml:space="preserve">12.5</w:t>
                   </w:r>
                 </w:p>
               </w:tc>
@@ -660,7 +660,7 @@
                     <w:jc w:val="center"/>
                   </w:pPr>
                   <w:r>
-                    <w:t xml:space="preserve">33.3</w:t>
+                    <w:t xml:space="preserve">33.9</w:t>
                   </w:r>
                 </w:p>
               </w:tc>
@@ -688,7 +688,7 @@
                     <w:jc w:val="center"/>
                   </w:pPr>
                   <w:r>
-                    <w:t xml:space="preserve">12</w:t>
+                    <w:t xml:space="preserve">11</w:t>
                   </w:r>
                 </w:p>
               </w:tc>
@@ -701,7 +701,7 @@
                     <w:jc w:val="center"/>
                   </w:pPr>
                   <w:r>
-                    <w:t xml:space="preserve">21.1</w:t>
+                    <w:t xml:space="preserve">19.6</w:t>
                   </w:r>
                 </w:p>
               </w:tc>
@@ -742,7 +742,7 @@
                     <w:jc w:val="center"/>
                   </w:pPr>
                   <w:r>
-                    <w:t xml:space="preserve">14</w:t>
+                    <w:t xml:space="preserve">14.3</w:t>
                   </w:r>
                 </w:p>
               </w:tc>
@@ -783,7 +783,7 @@
                     <w:jc w:val="center"/>
                   </w:pPr>
                   <w:r>
-                    <w:t xml:space="preserve">12.3</w:t>
+                    <w:t xml:space="preserve">12.5</w:t>
                   </w:r>
                 </w:p>
               </w:tc>
@@ -824,7 +824,7 @@
                     <w:jc w:val="center"/>
                   </w:pPr>
                   <w:r>
-                    <w:t xml:space="preserve">5.3</w:t>
+                    <w:t xml:space="preserve">5.4</w:t>
                   </w:r>
                 </w:p>
               </w:tc>
@@ -865,7 +865,7 @@
                     <w:jc w:val="center"/>
                   </w:pPr>
                   <w:r>
-                    <w:t xml:space="preserve">5.3</w:t>
+                    <w:t xml:space="preserve">5.4</w:t>
                   </w:r>
                 </w:p>
               </w:tc>
@@ -906,7 +906,7 @@
                     <w:jc w:val="center"/>
                   </w:pPr>
                   <w:r>
-                    <w:t xml:space="preserve">3.5</w:t>
+                    <w:t xml:space="preserve">3.6</w:t>
                   </w:r>
                 </w:p>
               </w:tc>
@@ -1163,17 +1163,21 @@
         <w:pStyle w:val="FirstParagraph"/>
       </w:pPr>
       <w:r>
-        <w:t xml:space="preserve">A separate collation spreadsheet (</w:t>
+        <w:t>A separate collation spreadsheet (1_jd_collation.xlsx, in this review package documents the full corpus of 97 source files, including 23 duplicate scrapes, 16 out-of-scope JDs, 2 broken files, and the 56 in-scope canonical JDs that contribute to this analysis. (One JD previously classified as in-scope, Maintenance_Supervisor.docx, was reclassified as out-of-scope during this analysis because the role is at Olympic Dam in South Australia, not Queensland.)</w:t>
       </w:r>
       <w:r>
         <w:rPr>
           <w:rStyle w:val="VerbatimChar"/>
         </w:rPr>
-        <w:t xml:space="preserve">all-jds-archive/JD Collation.xlsx</w:t>
-      </w:r>
-      <w:r>
-        <w:t xml:space="preserve">) documents the full corpus of 97 source files, including 23 duplicate scrapes, 16 out-of-scope JDs, 2 broken files, and the 57 in-scope canonical JDs that contribute to this analysis.</w:t>
-      </w:r>
+      </w:r>
+      <w:r/>
+      <w:r/>
+      <w:r>
+        <w:rPr>
+          <w:rStyle w:val="VerbatimChar"/>
+        </w:rPr>
+      </w:r>
+      <w:r/>
     </w:p>
     <w:bookmarkEnd w:id="24"/>
     <w:bookmarkEnd w:id="25"/>
@@ -1628,44 +1632,20 @@
         <w:rPr>
           <w:rStyle w:val="VerbatimChar"/>
         </w:rPr>
-        <w:t xml:space="preserve">required</w:t>
-      </w:r>
-      <w:r>
-        <w:t xml:space="preserve">: explicit</w:t>
-      </w:r>
-      <w:r>
-        <w:t xml:space="preserve"> </w:t>
-      </w:r>
-      <w:r>
-        <w:t xml:space="preserve">“must have”</w:t>
-      </w:r>
-      <w:r>
-        <w:t xml:space="preserve">,</w:t>
-      </w:r>
-      <w:r>
-        <w:t xml:space="preserve"> </w:t>
-      </w:r>
-      <w:r>
-        <w:t xml:space="preserve">“essential”</w:t>
-      </w:r>
-      <w:r>
-        <w:t xml:space="preserve"> </w:t>
-      </w:r>
-      <w:r>
-        <w:t xml:space="preserve">or</w:t>
-      </w:r>
-      <w:r>
-        <w:t xml:space="preserve"> </w:t>
-      </w:r>
-      <w:r>
-        <w:t xml:space="preserve">“required”</w:t>
-      </w:r>
-      <w:r>
-        <w:t xml:space="preserve"> </w:t>
-      </w:r>
-      <w:r>
-        <w:t xml:space="preserve">language.</w:t>
-      </w:r>
+        <w:t>required: the JD treats the item as a hard requirement, either through explicit "must have" / "essential" / "required" / "mandatory" language, or by listing it under a requirements-style section heading ("About You", "What you'll bring", "Qualifications", "Skills and Experience", "The successful candidate will possess", etc.) without softening.</w:t>
+      </w:r>
+      <w:r/>
+      <w:r/>
+      <w:r/>
+      <w:r/>
+      <w:r/>
+      <w:r/>
+      <w:r/>
+      <w:r/>
+      <w:r/>
+      <w:r/>
+      <w:r/>
+      <w:r/>
     </w:p>
     <w:p>
       <w:pPr>
@@ -1679,44 +1659,20 @@
         <w:rPr>
           <w:rStyle w:val="VerbatimChar"/>
         </w:rPr>
-        <w:t xml:space="preserve">desirable</w:t>
-      </w:r>
-      <w:r>
-        <w:t xml:space="preserve">: explicit</w:t>
-      </w:r>
-      <w:r>
-        <w:t xml:space="preserve"> </w:t>
-      </w:r>
-      <w:r>
-        <w:t xml:space="preserve">“desirable”</w:t>
-      </w:r>
-      <w:r>
-        <w:t xml:space="preserve">,</w:t>
-      </w:r>
-      <w:r>
-        <w:t xml:space="preserve"> </w:t>
-      </w:r>
-      <w:r>
-        <w:t xml:space="preserve">“preferred”</w:t>
-      </w:r>
-      <w:r>
-        <w:t xml:space="preserve"> </w:t>
-      </w:r>
-      <w:r>
-        <w:t xml:space="preserve">or</w:t>
-      </w:r>
-      <w:r>
-        <w:t xml:space="preserve"> </w:t>
-      </w:r>
-      <w:r>
-        <w:t xml:space="preserve">“advantageous”</w:t>
-      </w:r>
-      <w:r>
-        <w:t xml:space="preserve"> </w:t>
-      </w:r>
-      <w:r>
-        <w:t xml:space="preserve">language.</w:t>
-      </w:r>
+        <w:t>desirable: the bullet itself contains softening language ("desirable", "preferred", "advantageous", "highly regarded", "nice to have"), or the bullet sits under a softener section header (e.g. "It will also be beneficial if you have").</w:t>
+      </w:r>
+      <w:r/>
+      <w:r/>
+      <w:r/>
+      <w:r/>
+      <w:r/>
+      <w:r/>
+      <w:r/>
+      <w:r/>
+      <w:r/>
+      <w:r/>
+      <w:r/>
+      <w:r/>
     </w:p>
     <w:p>
       <w:pPr>
@@ -1730,11 +1686,9 @@
         <w:rPr>
           <w:rStyle w:val="VerbatimChar"/>
         </w:rPr>
-        <w:t xml:space="preserve">not_specified</w:t>
-      </w:r>
-      <w:r>
-        <w:t xml:space="preserve">: mentioned without explicit required or desirable framing.</w:t>
-      </w:r>
+        <w:t>not_specified: the row describes a duty performed in the role rather than a requirement the candidate must bring. Duty bullets are not requirements on the candidate, so they default to this flag.</w:t>
+      </w:r>
+      <w:r/>
     </w:p>
     <w:bookmarkEnd w:id="27"/>
     <w:bookmarkStart w:id="28" w:name="coding-workflow"/>
@@ -1751,20 +1705,15 @@
         <w:pStyle w:val="FirstParagraph"/>
       </w:pPr>
       <w:r>
-        <w:t xml:space="preserve">For each JD, both the curated metadata fields (from the project’s</w:t>
-      </w:r>
-      <w:r>
-        <w:t xml:space="preserve"> </w:t>
-      </w:r>
+        <w:t>For each JD, both the curated metadata fields (company, role, sector, role type, location) and the full source text were read. Each codable phrase was tagged with category, code, supporting quote, required flag, and confidence rating.</w:t>
+      </w:r>
+      <w:r/>
       <w:r>
         <w:rPr>
           <w:rStyle w:val="VerbatimChar"/>
         </w:rPr>
-        <w:t xml:space="preserve">data.json</w:t>
-      </w:r>
-      <w:r>
-        <w:t xml:space="preserve">) and the full source text were read. Each codable phrase was tagged with category, code, supporting quote, required flag, and confidence rating.</w:t>
-      </w:r>
+      </w:r>
+      <w:r/>
     </w:p>
     <w:p>
       <w:pPr>
@@ -1818,7 +1767,7 @@
         <w:t xml:space="preserve"> </w:t>
       </w:r>
       <w:r>
-        <w:t xml:space="preserve">All 57 JDs were coded by a single analyst with LLM assistance, audited manually. Inter-coder reliability is not established.</w:t>
+        <w:t xml:space="preserve">All 56 JDs were coded by a single analyst with LLM assistance, with every coded row audited against the source JD via a literal-substring verifier. Inter-coder reliability is not established.</w:t>
       </w:r>
     </w:p>
     <w:p>
@@ -1834,14 +1783,13 @@
           <w:b/>
           <w:bCs/>
         </w:rPr>
-        <w:t xml:space="preserve">Conservative</w:t>
+        <w:t xml:space="preserve">Required-flag interpretation. </w:t>
       </w:r>
       <w:r>
         <w:rPr>
           <w:b/>
           <w:bCs/>
         </w:rPr>
-        <w:t xml:space="preserve"> </w:t>
       </w:r>
       <w:r>
         <w:rPr>
@@ -1849,90 +1797,53 @@
           <w:b/>
           <w:bCs/>
         </w:rPr>
-        <w:t xml:space="preserve">required</w:t>
       </w:r>
       <w:r>
         <w:rPr>
           <w:b/>
           <w:bCs/>
         </w:rPr>
-        <w:t xml:space="preserve"> </w:t>
       </w:r>
       <w:r>
         <w:rPr>
           <w:b/>
           <w:bCs/>
         </w:rPr>
-        <w:t xml:space="preserve">coding.</w:t>
-      </w:r>
-      <w:r>
-        <w:t xml:space="preserve"> </w:t>
-      </w:r>
-      <w:r>
-        <w:t xml:space="preserve">The flag was applied only where JDs used explicit</w:t>
-      </w:r>
-      <w:r>
-        <w:t xml:space="preserve"> </w:t>
-      </w:r>
-      <w:r>
-        <w:t xml:space="preserve">“must”</w:t>
-      </w:r>
-      <w:r>
-        <w:t xml:space="preserve"> </w:t>
-      </w:r>
-      <w:r>
-        <w:t xml:space="preserve">or</w:t>
-      </w:r>
-      <w:r>
-        <w:t xml:space="preserve"> </w:t>
-      </w:r>
-      <w:r>
-        <w:t xml:space="preserve">“essential”</w:t>
-      </w:r>
-      <w:r>
-        <w:t xml:space="preserve"> </w:t>
-      </w:r>
-      <w:r>
-        <w:t xml:space="preserve">language. Items listed under a</w:t>
-      </w:r>
-      <w:r>
-        <w:t xml:space="preserve"> </w:t>
-      </w:r>
-      <w:r>
-        <w:t xml:space="preserve">“Requirements”</w:t>
-      </w:r>
-      <w:r>
-        <w:t xml:space="preserve"> </w:t>
-      </w:r>
-      <w:r>
-        <w:t xml:space="preserve">heading without those markers were coded</w:t>
-      </w:r>
-      <w:r>
-        <w:t xml:space="preserve"> </w:t>
-      </w:r>
+      </w:r>
+      <w:r/>
+      <w:r/>
+      <w:r/>
+      <w:r/>
+      <w:r/>
+      <w:r/>
+      <w:r/>
+      <w:r/>
+      <w:r/>
+      <w:r/>
+      <w:r/>
+      <w:r/>
+      <w:r/>
+      <w:r/>
+      <w:r/>
       <w:r>
         <w:rPr>
           <w:rStyle w:val="VerbatimChar"/>
         </w:rPr>
-        <w:t xml:space="preserve">not_specified</w:t>
-      </w:r>
-      <w:r>
-        <w:t xml:space="preserve">. Frequencies of</w:t>
-      </w:r>
-      <w:r>
-        <w:t xml:space="preserve"> </w:t>
-      </w:r>
+      </w:r>
+      <w:r/>
+      <w:r/>
       <w:r>
         <w:rPr>
           <w:rStyle w:val="VerbatimChar"/>
         </w:rPr>
-        <w:t xml:space="preserve">required</w:t>
-      </w:r>
-      <w:r>
-        <w:t xml:space="preserve"> </w:t>
-      </w:r>
-      <w:r>
-        <w:t xml:space="preserve">items therefore represent a floor, not the true rate.</w:t>
+      </w:r>
+      <w:r/>
+      <w:r/>
+      <w:r>
+        <w:rPr>
+          <w:b w:val="0"/>
+        </w:rPr>
+        <w:t>A row is required when the JD treats it as a hard requirement, including when the bullet sits under a requirements-style section heading without softening language. JDs vary widely in how forcefully they word requirements, so the boundary between required and desirable is sometimes a judgement call at the bullet level.</w:t>
       </w:r>
     </w:p>
     <w:p>
@@ -1948,13 +1859,15 @@
           <w:b/>
           <w:bCs/>
         </w:rPr>
-        <w:t xml:space="preserve">Source text quality varies.</w:t>
-      </w:r>
-      <w:r>
-        <w:t xml:space="preserve"> </w:t>
-      </w:r>
-      <w:r>
-        <w:t xml:space="preserve">Some JDs preserved only their Qualifications section in extracted text; others provided a formal Position Description. The depth of coding per JD partially reflects source completeness.</w:t>
+        <w:t xml:space="preserve">Source detail varies across JDs. </w:t>
+      </w:r>
+      <w:r/>
+      <w:r/>
+      <w:r>
+        <w:rPr>
+          <w:b w:val="0"/>
+        </w:rPr>
+        <w:t>Some JDs are short SEEK or Indeed advertisements with only a handful of headline requirements; others are full multi-page Position Descriptions with detailed responsibilities, qualifications, and knowledge requirements. A JD with fewer coded rows usually reflects less source text, not a coding gap.</w:t>
       </w:r>
     </w:p>
     <w:p>
@@ -1976,7 +1889,7 @@
         <w:t xml:space="preserve"> </w:t>
       </w:r>
       <w:r>
-        <w:t xml:space="preserve">29 of 57 JDs (51%) are Coal Surface roles. Cross-sector comparisons should be read with the underlying sample sizes in mind.</w:t>
+        <w:t xml:space="preserve">29 of 56 JDs (52%) are Coal Surface roles. Cross-sector comparisons should be read with the underlying sample sizes in mind.</w:t>
       </w:r>
     </w:p>
     <w:bookmarkEnd w:id="29"/>
@@ -2029,7 +1942,7 @@
               <w:pStyle w:val="ImageCaption"/>
             </w:pPr>
             <w:r>
-              <w:t xml:space="preserve">Table 3: Duties: frequency across all 57 JDs</w:t>
+              <w:t xml:space="preserve">Table 3: Duties: frequency across all 56 JDs</w:t>
             </w:r>
           </w:p>
           <w:tbl>
@@ -2137,7 +2050,7 @@
                     <w:jc w:val="center"/>
                   </w:pPr>
                   <w:r>
-                    <w:t xml:space="preserve">34</w:t>
+                    <w:t xml:space="preserve">39</w:t>
                   </w:r>
                 </w:p>
               </w:tc>
@@ -2150,7 +2063,7 @@
                     <w:jc w:val="center"/>
                   </w:pPr>
                   <w:r>
-                    <w:t xml:space="preserve">59.6</w:t>
+                    <w:t xml:space="preserve">69.6</w:t>
                   </w:r>
                 </w:p>
               </w:tc>
@@ -2165,7 +2078,7 @@
                     <w:jc w:val="center"/>
                   </w:pPr>
                   <w:r>
-                    <w:t xml:space="preserve">D6</w:t>
+                    <w:t xml:space="preserve">D2</w:t>
                   </w:r>
                 </w:p>
               </w:tc>
@@ -2178,7 +2091,7 @@
                     <w:jc w:val="center"/>
                   </w:pPr>
                   <w:r>
-                    <w:t xml:space="preserve">Promote safety culture</w:t>
+                    <w:t xml:space="preserve">Coach &amp; mentor</w:t>
                   </w:r>
                 </w:p>
               </w:tc>
@@ -2191,7 +2104,7 @@
                     <w:jc w:val="center"/>
                   </w:pPr>
                   <w:r>
-                    <w:t xml:space="preserve">30</w:t>
+                    <w:t xml:space="preserve">31</w:t>
                   </w:r>
                 </w:p>
               </w:tc>
@@ -2204,7 +2117,7 @@
                     <w:jc w:val="center"/>
                   </w:pPr>
                   <w:r>
-                    <w:t xml:space="preserve">52.6</w:t>
+                    <w:t xml:space="preserve">55.4</w:t>
                   </w:r>
                 </w:p>
               </w:tc>
@@ -2219,7 +2132,7 @@
                     <w:jc w:val="center"/>
                   </w:pPr>
                   <w:r>
-                    <w:t xml:space="preserve">D2</w:t>
+                    <w:t xml:space="preserve">D7</w:t>
                   </w:r>
                 </w:p>
               </w:tc>
@@ -2232,7 +2145,7 @@
                     <w:jc w:val="center"/>
                   </w:pPr>
                   <w:r>
-                    <w:t xml:space="preserve">Coach &amp; mentor</w:t>
+                    <w:t xml:space="preserve">Oversee daily operations</w:t>
                   </w:r>
                 </w:p>
               </w:tc>
@@ -2245,7 +2158,7 @@
                     <w:jc w:val="center"/>
                   </w:pPr>
                   <w:r>
-                    <w:t xml:space="preserve">28</w:t>
+                    <w:t xml:space="preserve">30</w:t>
                   </w:r>
                 </w:p>
               </w:tc>
@@ -2258,7 +2171,7 @@
                     <w:jc w:val="center"/>
                   </w:pPr>
                   <w:r>
-                    <w:t xml:space="preserve">49.1</w:t>
+                    <w:t xml:space="preserve">53.6</w:t>
                   </w:r>
                 </w:p>
               </w:tc>
@@ -2273,7 +2186,7 @@
                     <w:jc w:val="center"/>
                   </w:pPr>
                   <w:r>
-                    <w:t xml:space="preserve">D5</w:t>
+                    <w:t xml:space="preserve">D6</w:t>
                   </w:r>
                 </w:p>
               </w:tc>
@@ -2286,7 +2199,7 @@
                     <w:jc w:val="center"/>
                   </w:pPr>
                   <w:r>
-                    <w:t xml:space="preserve">Statutory compliance</w:t>
+                    <w:t xml:space="preserve">Promote safety culture</w:t>
                   </w:r>
                 </w:p>
               </w:tc>
@@ -2299,7 +2212,7 @@
                     <w:jc w:val="center"/>
                   </w:pPr>
                   <w:r>
-                    <w:t xml:space="preserve">27</w:t>
+                    <w:t xml:space="preserve">28</w:t>
                   </w:r>
                 </w:p>
               </w:tc>
@@ -2312,7 +2225,7 @@
                     <w:jc w:val="center"/>
                   </w:pPr>
                   <w:r>
-                    <w:t xml:space="preserve">47.4</w:t>
+                    <w:t xml:space="preserve">50</w:t>
                   </w:r>
                 </w:p>
               </w:tc>
@@ -2327,7 +2240,7 @@
                     <w:jc w:val="center"/>
                   </w:pPr>
                   <w:r>
-                    <w:t xml:space="preserve">D12</w:t>
+                    <w:t xml:space="preserve">D11</w:t>
                   </w:r>
                 </w:p>
               </w:tc>
@@ -2340,7 +2253,7 @@
                     <w:jc w:val="center"/>
                   </w:pPr>
                   <w:r>
-                    <w:t xml:space="preserve">Reporting &amp; admin</w:t>
+                    <w:t xml:space="preserve">Plan &amp; schedule work</w:t>
                   </w:r>
                 </w:p>
               </w:tc>
@@ -2353,7 +2266,7 @@
                     <w:jc w:val="center"/>
                   </w:pPr>
                   <w:r>
-                    <w:t xml:space="preserve">21</w:t>
+                    <w:t xml:space="preserve">25</w:t>
                   </w:r>
                 </w:p>
               </w:tc>
@@ -2366,7 +2279,7 @@
                     <w:jc w:val="center"/>
                   </w:pPr>
                   <w:r>
-                    <w:t xml:space="preserve">36.8</w:t>
+                    <w:t xml:space="preserve">44.6</w:t>
                   </w:r>
                 </w:p>
               </w:tc>
@@ -2381,7 +2294,7 @@
                     <w:jc w:val="center"/>
                   </w:pPr>
                   <w:r>
-                    <w:t xml:space="preserve">D7</w:t>
+                    <w:t xml:space="preserve">D5</w:t>
                   </w:r>
                 </w:p>
               </w:tc>
@@ -2394,7 +2307,7 @@
                     <w:jc w:val="center"/>
                   </w:pPr>
                   <w:r>
-                    <w:t xml:space="preserve">Oversee daily operations</w:t>
+                    <w:t xml:space="preserve">Statutory compliance</w:t>
                   </w:r>
                 </w:p>
               </w:tc>
@@ -2407,7 +2320,7 @@
                     <w:jc w:val="center"/>
                   </w:pPr>
                   <w:r>
-                    <w:t xml:space="preserve">21</w:t>
+                    <w:t xml:space="preserve">25</w:t>
                   </w:r>
                 </w:p>
               </w:tc>
@@ -2420,7 +2333,7 @@
                     <w:jc w:val="center"/>
                   </w:pPr>
                   <w:r>
-                    <w:t xml:space="preserve">36.8</w:t>
+                    <w:t xml:space="preserve">44.6</w:t>
                   </w:r>
                 </w:p>
               </w:tc>
@@ -2461,7 +2374,7 @@
                     <w:jc w:val="center"/>
                   </w:pPr>
                   <w:r>
-                    <w:t xml:space="preserve">21</w:t>
+                    <w:t xml:space="preserve">24</w:t>
                   </w:r>
                 </w:p>
               </w:tc>
@@ -2474,7 +2387,7 @@
                     <w:jc w:val="center"/>
                   </w:pPr>
                   <w:r>
-                    <w:t xml:space="preserve">36.8</w:t>
+                    <w:t xml:space="preserve">42.9</w:t>
                   </w:r>
                 </w:p>
               </w:tc>
@@ -2489,7 +2402,7 @@
                     <w:jc w:val="center"/>
                   </w:pPr>
                   <w:r>
-                    <w:t xml:space="preserve">D8</w:t>
+                    <w:t xml:space="preserve">D12</w:t>
                   </w:r>
                 </w:p>
               </w:tc>
@@ -2502,7 +2415,7 @@
                     <w:jc w:val="center"/>
                   </w:pPr>
                   <w:r>
-                    <w:t xml:space="preserve">Manage production/targets</w:t>
+                    <w:t xml:space="preserve">Reporting &amp; admin</w:t>
                   </w:r>
                 </w:p>
               </w:tc>
@@ -2515,7 +2428,7 @@
                     <w:jc w:val="center"/>
                   </w:pPr>
                   <w:r>
-                    <w:t xml:space="preserve">20</w:t>
+                    <w:t xml:space="preserve">22</w:t>
                   </w:r>
                 </w:p>
               </w:tc>
@@ -2528,7 +2441,7 @@
                     <w:jc w:val="center"/>
                   </w:pPr>
                   <w:r>
-                    <w:t xml:space="preserve">35.1</w:t>
+                    <w:t xml:space="preserve">39.3</w:t>
                   </w:r>
                 </w:p>
               </w:tc>
@@ -2543,7 +2456,7 @@
                     <w:jc w:val="center"/>
                   </w:pPr>
                   <w:r>
-                    <w:t xml:space="preserve">D16</w:t>
+                    <w:t xml:space="preserve">D8</w:t>
                   </w:r>
                 </w:p>
               </w:tc>
@@ -2556,7 +2469,7 @@
                     <w:jc w:val="center"/>
                   </w:pPr>
                   <w:r>
-                    <w:t xml:space="preserve">Cross-functional collaboration</w:t>
+                    <w:t xml:space="preserve">Manage production/targets</w:t>
                   </w:r>
                 </w:p>
               </w:tc>
@@ -2569,7 +2482,7 @@
                     <w:jc w:val="center"/>
                   </w:pPr>
                   <w:r>
-                    <w:t xml:space="preserve">19</w:t>
+                    <w:t xml:space="preserve">21</w:t>
                   </w:r>
                 </w:p>
               </w:tc>
@@ -2582,7 +2495,7 @@
                     <w:jc w:val="center"/>
                   </w:pPr>
                   <w:r>
-                    <w:t xml:space="preserve">33.3</w:t>
+                    <w:t xml:space="preserve">37.5</w:t>
                   </w:r>
                 </w:p>
               </w:tc>
@@ -2597,7 +2510,7 @@
                     <w:jc w:val="center"/>
                   </w:pPr>
                   <w:r>
-                    <w:t xml:space="preserve">D15</w:t>
+                    <w:t xml:space="preserve">D16</w:t>
                   </w:r>
                 </w:p>
               </w:tc>
@@ -2610,7 +2523,7 @@
                     <w:jc w:val="center"/>
                   </w:pPr>
                   <w:r>
-                    <w:t xml:space="preserve">Environmental &amp; quality</w:t>
+                    <w:t xml:space="preserve">Cross-functional collaboration</w:t>
                   </w:r>
                 </w:p>
               </w:tc>
@@ -2623,7 +2536,7 @@
                     <w:jc w:val="center"/>
                   </w:pPr>
                   <w:r>
-                    <w:t xml:space="preserve">15</w:t>
+                    <w:t xml:space="preserve">20</w:t>
                   </w:r>
                 </w:p>
               </w:tc>
@@ -2636,7 +2549,7 @@
                     <w:jc w:val="center"/>
                   </w:pPr>
                   <w:r>
-                    <w:t xml:space="preserve">26.3</w:t>
+                    <w:t xml:space="preserve">35.7</w:t>
                   </w:r>
                 </w:p>
               </w:tc>
@@ -2651,7 +2564,7 @@
                     <w:jc w:val="center"/>
                   </w:pPr>
                   <w:r>
-                    <w:t xml:space="preserve">D11</w:t>
+                    <w:t xml:space="preserve">D4</w:t>
                   </w:r>
                 </w:p>
               </w:tc>
@@ -2664,7 +2577,7 @@
                     <w:jc w:val="center"/>
                   </w:pPr>
                   <w:r>
-                    <w:t xml:space="preserve">Plan &amp; schedule work</w:t>
+                    <w:t xml:space="preserve">Safety leadership activities</w:t>
                   </w:r>
                 </w:p>
               </w:tc>
@@ -2677,7 +2590,7 @@
                     <w:jc w:val="center"/>
                   </w:pPr>
                   <w:r>
-                    <w:t xml:space="preserve">15</w:t>
+                    <w:t xml:space="preserve">20</w:t>
                   </w:r>
                 </w:p>
               </w:tc>
@@ -2690,7 +2603,7 @@
                     <w:jc w:val="center"/>
                   </w:pPr>
                   <w:r>
-                    <w:t xml:space="preserve">26.3</w:t>
+                    <w:t xml:space="preserve">35.7</w:t>
                   </w:r>
                 </w:p>
               </w:tc>
@@ -2705,7 +2618,7 @@
                     <w:jc w:val="center"/>
                   </w:pPr>
                   <w:r>
-                    <w:t xml:space="preserve">D4</w:t>
+                    <w:t xml:space="preserve">D9</w:t>
                   </w:r>
                 </w:p>
               </w:tc>
@@ -2718,7 +2631,7 @@
                     <w:jc w:val="center"/>
                   </w:pPr>
                   <w:r>
-                    <w:t xml:space="preserve">Safety leadership activities</w:t>
+                    <w:t xml:space="preserve">Coordinate resources</w:t>
                   </w:r>
                 </w:p>
               </w:tc>
@@ -2731,7 +2644,7 @@
                     <w:jc w:val="center"/>
                   </w:pPr>
                   <w:r>
-                    <w:t xml:space="preserve">14</w:t>
+                    <w:t xml:space="preserve">16</w:t>
                   </w:r>
                 </w:p>
               </w:tc>
@@ -2744,7 +2657,7 @@
                     <w:jc w:val="center"/>
                   </w:pPr>
                   <w:r>
-                    <w:t xml:space="preserve">24.6</w:t>
+                    <w:t xml:space="preserve">28.6</w:t>
                   </w:r>
                 </w:p>
               </w:tc>
@@ -2785,7 +2698,7 @@
                     <w:jc w:val="center"/>
                   </w:pPr>
                   <w:r>
-                    <w:t xml:space="preserve">10</w:t>
+                    <w:t xml:space="preserve">11</w:t>
                   </w:r>
                 </w:p>
               </w:tc>
@@ -2798,7 +2711,7 @@
                     <w:jc w:val="center"/>
                   </w:pPr>
                   <w:r>
-                    <w:t xml:space="preserve">17.5</w:t>
+                    <w:t xml:space="preserve">19.6</w:t>
                   </w:r>
                 </w:p>
               </w:tc>
@@ -2813,7 +2726,7 @@
                     <w:jc w:val="center"/>
                   </w:pPr>
                   <w:r>
-                    <w:t xml:space="preserve">D9</w:t>
+                    <w:t xml:space="preserve">D17</w:t>
                   </w:r>
                 </w:p>
               </w:tc>
@@ -2826,7 +2739,7 @@
                     <w:jc w:val="center"/>
                   </w:pPr>
                   <w:r>
-                    <w:t xml:space="preserve">Coordinate resources</w:t>
+                    <w:t xml:space="preserve">Training &amp; competency assurance</w:t>
                   </w:r>
                 </w:p>
               </w:tc>
@@ -2839,7 +2752,7 @@
                     <w:jc w:val="center"/>
                   </w:pPr>
                   <w:r>
-                    <w:t xml:space="preserve">8</w:t>
+                    <w:t xml:space="preserve">11</w:t>
                   </w:r>
                 </w:p>
               </w:tc>
@@ -2852,7 +2765,7 @@
                     <w:jc w:val="center"/>
                   </w:pPr>
                   <w:r>
-                    <w:t xml:space="preserve">14</w:t>
+                    <w:t xml:space="preserve">19.6</w:t>
                   </w:r>
                 </w:p>
               </w:tc>
@@ -2867,7 +2780,7 @@
                     <w:jc w:val="center"/>
                   </w:pPr>
                   <w:r>
-                    <w:t xml:space="preserve">D17</w:t>
+                    <w:t xml:space="preserve">D15</w:t>
                   </w:r>
                 </w:p>
               </w:tc>
@@ -2880,7 +2793,7 @@
                     <w:jc w:val="center"/>
                   </w:pPr>
                   <w:r>
-                    <w:t xml:space="preserve">Training &amp; competency assurance</w:t>
+                    <w:t xml:space="preserve">Environmental &amp; quality</w:t>
                   </w:r>
                 </w:p>
               </w:tc>
@@ -2893,7 +2806,7 @@
                     <w:jc w:val="center"/>
                   </w:pPr>
                   <w:r>
-                    <w:t xml:space="preserve">6</w:t>
+                    <w:t xml:space="preserve">11</w:t>
                   </w:r>
                 </w:p>
               </w:tc>
@@ -2906,7 +2819,7 @@
                     <w:jc w:val="center"/>
                   </w:pPr>
                   <w:r>
-                    <w:t xml:space="preserve">10.5</w:t>
+                    <w:t xml:space="preserve">19.6</w:t>
                   </w:r>
                 </w:p>
               </w:tc>
@@ -2947,7 +2860,7 @@
                     <w:jc w:val="center"/>
                   </w:pPr>
                   <w:r>
-                    <w:t xml:space="preserve">6</w:t>
+                    <w:t xml:space="preserve">5</w:t>
                   </w:r>
                 </w:p>
               </w:tc>
@@ -2960,7 +2873,7 @@
                     <w:jc w:val="center"/>
                   </w:pPr>
                   <w:r>
-                    <w:t xml:space="preserve">10.5</w:t>
+                    <w:t xml:space="preserve">8.9</w:t>
                   </w:r>
                 </w:p>
               </w:tc>
@@ -3001,7 +2914,7 @@
                     <w:jc w:val="center"/>
                   </w:pPr>
                   <w:r>
-                    <w:t xml:space="preserve">5</w:t>
+                    <w:t xml:space="preserve">4</w:t>
                   </w:r>
                 </w:p>
               </w:tc>
@@ -3014,7 +2927,7 @@
                     <w:jc w:val="center"/>
                   </w:pPr>
                   <w:r>
-                    <w:t xml:space="preserve">8.8</w:t>
+                    <w:t xml:space="preserve">7.1</w:t>
                   </w:r>
                 </w:p>
               </w:tc>
@@ -3055,7 +2968,7 @@
                     <w:jc w:val="center"/>
                   </w:pPr>
                   <w:r>
-                    <w:t xml:space="preserve">3</w:t>
+                    <w:t xml:space="preserve">2</w:t>
                   </w:r>
                 </w:p>
               </w:tc>
@@ -3068,7 +2981,7 @@
                     <w:jc w:val="center"/>
                   </w:pPr>
                   <w:r>
-                    <w:t xml:space="preserve">5.3</w:t>
+                    <w:t xml:space="preserve">3.6</w:t>
                   </w:r>
                 </w:p>
               </w:tc>
@@ -3124,7 +3037,7 @@
             <w:r>
               <w:drawing>
                 <wp:inline>
-                  <wp:extent cx="5073650" cy="2704351"/>
+                  <wp:extent cx="5073650" cy="3826377"/>
                   <wp:effectExtent b="0" l="0" r="0" t="0"/>
                   <wp:docPr descr="" title="" id="33" name="Picture"/>
                   <a:graphic>
@@ -3145,7 +3058,7 @@
                         <pic:spPr bwMode="auto">
                           <a:xfrm>
                             <a:off x="0" y="0"/>
-                            <a:ext cx="5073650" cy="2704351"/>
+                            <a:ext cx="5073650" cy="3826377"/>
                           </a:xfrm>
                           <a:prstGeom prst="rect">
                             <a:avLst/>
@@ -3174,7 +3087,7 @@
               <w:pStyle w:val="ImageCaption"/>
             </w:pPr>
             <w:r>
-              <w:t xml:space="preserve">Figure 1: Top 12 duties across 57 JDs</w:t>
+              <w:t xml:space="preserve">Figure 1: Top 12 duties across 56 JDs</w:t>
             </w:r>
           </w:p>
           <w:bookmarkEnd w:id="35"/>
@@ -3202,7 +3115,7 @@
         </w:numPr>
       </w:pPr>
       <w:r>
-        <w:t xml:space="preserve">The four most-named duties are D1 (supervise and lead crews/contractors, 34 JDs, 60%), D6 (promote and uphold safety culture, 30 JDs, 53%), D2 (coach, mentor and develop team capability, 28 JDs, 49%), and D5 (ensure statutory compliance, 27 JDs, 47%).</w:t>
+        <w:t xml:space="preserve">The four most-named duties are D1 (supervise and lead crews/contractors, 39 JDs, 70%), D2 (coach, mentor and develop team capability, 31 JDs, 55%), D7 (oversee daily operations, 30 JDs, 54%), and D6 (promote and uphold safety culture, 28 JDs, 50%).</w:t>
       </w:r>
     </w:p>
     <w:p>
@@ -3214,7 +3127,7 @@
         </w:numPr>
       </w:pPr>
       <w:r>
-        <w:t xml:space="preserve">Three duties are tied at 22 JDs (39%): D7 (oversee daily operations), D10 (drive continuous improvement), and D12 (reporting, budgets and administration).</w:t>
+        <w:t xml:space="preserve">A close cluster sits just below: D11 (plan and schedule work) and D5 (ensure statutory compliance) are both in 25 JDs (45%); D10 (drive continuous improvement) in 24 (43%); D12 (reporting, budgets and administration) in 22 (39%).</w:t>
       </w:r>
     </w:p>
     <w:p>
@@ -3226,7 +3139,7 @@
         </w:numPr>
       </w:pPr>
       <w:r>
-        <w:t xml:space="preserve">The least-named duties are D13 (incident investigation, 5 JDs, 9%) and D14 (permits, isolations and high-risk activity management, 3 JDs, 5%).</w:t>
+        <w:t xml:space="preserve">The least-named duties are D14 (permits, isolations and high-risk activity management, 2 JDs, 4%) and D13 (incident investigation, 4 JDs, 7%).</w:t>
       </w:r>
     </w:p>
     <w:p>
@@ -3238,7 +3151,7 @@
         </w:numPr>
       </w:pPr>
       <w:r>
-        <w:t xml:space="preserve">D17 (training delivery and competency assurance) is named in 6 JDs (10%): one Coal Surface (Supervisor Blast Crew Goonyella), one Coal Underground (Development Supervisor BHP/BMA), two Minerals Surface (Glencore 2, Thiess Mining), and two Quarry (Boral Narangba, BQC).</w:t>
+        <w:t xml:space="preserve">D17 (training delivery and competency assurance) is named in 11 JDs (20%), with appearances across all five sectors.</w:t>
       </w:r>
     </w:p>
     <w:p>
@@ -3250,7 +3163,7 @@
         </w:numPr>
       </w:pPr>
       <w:r>
-        <w:t xml:space="preserve">D13 (incident investigation) is named in 5 JDs: three Coal Surface (BHP Lead Supervisor Shutdown, Thiess Maintenance Mackay, BHP) and two Minerals Surface (Macmahon, Thiess Mining).</w:t>
+        <w:t xml:space="preserve">D18 (shift management and handover) is named in 5 JDs (9%), most in Production Supervisor roles where shift handover is a routine duty.</w:t>
       </w:r>
     </w:p>
     <w:tbl>
@@ -3290,7 +3203,7 @@
             <w:r>
               <w:drawing>
                 <wp:inline>
-                  <wp:extent cx="5372100" cy="3277188"/>
+                  <wp:extent cx="5372100" cy="5747027"/>
                   <wp:effectExtent b="0" l="0" r="0" t="0"/>
                   <wp:docPr descr="" title="" id="37" name="Picture"/>
                   <a:graphic>
@@ -3311,7 +3224,7 @@
                         <pic:spPr bwMode="auto">
                           <a:xfrm>
                             <a:off x="0" y="0"/>
-                            <a:ext cx="5372100" cy="3277188"/>
+                            <a:ext cx="5372100" cy="5747027"/>
                           </a:xfrm>
                           <a:prstGeom prst="rect">
                             <a:avLst/>
@@ -3396,7 +3309,7 @@
               <w:pStyle w:val="ImageCaption"/>
             </w:pPr>
             <w:r>
-              <w:t xml:space="preserve">Table 4: Dispositions: frequency across all 57 JDs</w:t>
+              <w:t xml:space="preserve">Table 4: Dispositions: frequency across all 56 JDs</w:t>
             </w:r>
           </w:p>
           <w:tbl>
@@ -3504,7 +3417,7 @@
                     <w:jc w:val="center"/>
                   </w:pPr>
                   <w:r>
-                    <w:t xml:space="preserve">31</w:t>
+                    <w:t xml:space="preserve">28</w:t>
                   </w:r>
                 </w:p>
               </w:tc>
@@ -3517,7 +3430,7 @@
                     <w:jc w:val="center"/>
                   </w:pPr>
                   <w:r>
-                    <w:t xml:space="preserve">54.4</w:t>
+                    <w:t xml:space="preserve">50</w:t>
                   </w:r>
                 </w:p>
               </w:tc>
@@ -3558,7 +3471,7 @@
                     <w:jc w:val="center"/>
                   </w:pPr>
                   <w:r>
-                    <w:t xml:space="preserve">21</w:t>
+                    <w:t xml:space="preserve">22</w:t>
                   </w:r>
                 </w:p>
               </w:tc>
@@ -3571,7 +3484,7 @@
                     <w:jc w:val="center"/>
                   </w:pPr>
                   <w:r>
-                    <w:t xml:space="preserve">36.8</w:t>
+                    <w:t xml:space="preserve">39.3</w:t>
                   </w:r>
                 </w:p>
               </w:tc>
@@ -3612,7 +3525,7 @@
                     <w:jc w:val="center"/>
                   </w:pPr>
                   <w:r>
-                    <w:t xml:space="preserve">12</w:t>
+                    <w:t xml:space="preserve">14</w:t>
                   </w:r>
                 </w:p>
               </w:tc>
@@ -3625,7 +3538,7 @@
                     <w:jc w:val="center"/>
                   </w:pPr>
                   <w:r>
-                    <w:t xml:space="preserve">21.1</w:t>
+                    <w:t xml:space="preserve">25</w:t>
                   </w:r>
                 </w:p>
               </w:tc>
@@ -3640,7 +3553,7 @@
                     <w:jc w:val="center"/>
                   </w:pPr>
                   <w:r>
-                    <w:t xml:space="preserve">DP6</w:t>
+                    <w:t xml:space="preserve">DP5</w:t>
                   </w:r>
                 </w:p>
               </w:tc>
@@ -3653,7 +3566,7 @@
                     <w:jc w:val="center"/>
                   </w:pPr>
                   <w:r>
-                    <w:t xml:space="preserve">Problem-solver</w:t>
+                    <w:t xml:space="preserve">Hands-on, lead by example</w:t>
                   </w:r>
                 </w:p>
               </w:tc>
@@ -3666,7 +3579,7 @@
                     <w:jc w:val="center"/>
                   </w:pPr>
                   <w:r>
-                    <w:t xml:space="preserve">12</w:t>
+                    <w:t xml:space="preserve">14</w:t>
                   </w:r>
                 </w:p>
               </w:tc>
@@ -3679,7 +3592,7 @@
                     <w:jc w:val="center"/>
                   </w:pPr>
                   <w:r>
-                    <w:t xml:space="preserve">21.1</w:t>
+                    <w:t xml:space="preserve">25</w:t>
                   </w:r>
                 </w:p>
               </w:tc>
@@ -3694,7 +3607,7 @@
                     <w:jc w:val="center"/>
                   </w:pPr>
                   <w:r>
-                    <w:t xml:space="preserve">DP13</w:t>
+                    <w:t xml:space="preserve">DP3</w:t>
                   </w:r>
                 </w:p>
               </w:tc>
@@ -3707,7 +3620,7 @@
                     <w:jc w:val="center"/>
                   </w:pPr>
                   <w:r>
-                    <w:t xml:space="preserve">Time management</w:t>
+                    <w:t xml:space="preserve">People-focused / caring</w:t>
                   </w:r>
                 </w:p>
               </w:tc>
@@ -3720,7 +3633,7 @@
                     <w:jc w:val="center"/>
                   </w:pPr>
                   <w:r>
-                    <w:t xml:space="preserve">8</w:t>
+                    <w:t xml:space="preserve">13</w:t>
                   </w:r>
                 </w:p>
               </w:tc>
@@ -3733,7 +3646,7 @@
                     <w:jc w:val="center"/>
                   </w:pPr>
                   <w:r>
-                    <w:t xml:space="preserve">14</w:t>
+                    <w:t xml:space="preserve">23.2</w:t>
                   </w:r>
                 </w:p>
               </w:tc>
@@ -3748,7 +3661,7 @@
                     <w:jc w:val="center"/>
                   </w:pPr>
                   <w:r>
-                    <w:t xml:space="preserve">DP12</w:t>
+                    <w:t xml:space="preserve">DP6</w:t>
                   </w:r>
                 </w:p>
               </w:tc>
@@ -3761,7 +3674,7 @@
                     <w:jc w:val="center"/>
                   </w:pPr>
                   <w:r>
-                    <w:t xml:space="preserve">Decision-making under pressure</w:t>
+                    <w:t xml:space="preserve">Problem-solver</w:t>
                   </w:r>
                 </w:p>
               </w:tc>
@@ -3774,7 +3687,7 @@
                     <w:jc w:val="center"/>
                   </w:pPr>
                   <w:r>
-                    <w:t xml:space="preserve">7</w:t>
+                    <w:t xml:space="preserve">12</w:t>
                   </w:r>
                 </w:p>
               </w:tc>
@@ -3787,7 +3700,7 @@
                     <w:jc w:val="center"/>
                   </w:pPr>
                   <w:r>
-                    <w:t xml:space="preserve">12.3</w:t>
+                    <w:t xml:space="preserve">21.4</w:t>
                   </w:r>
                 </w:p>
               </w:tc>
@@ -3802,7 +3715,7 @@
                     <w:jc w:val="center"/>
                   </w:pPr>
                   <w:r>
-                    <w:t xml:space="preserve">DP5</w:t>
+                    <w:t xml:space="preserve">DP13</w:t>
                   </w:r>
                 </w:p>
               </w:tc>
@@ -3815,7 +3728,7 @@
                     <w:jc w:val="center"/>
                   </w:pPr>
                   <w:r>
-                    <w:t xml:space="preserve">Hands-on, lead by example</w:t>
+                    <w:t xml:space="preserve">Time management</w:t>
                   </w:r>
                 </w:p>
               </w:tc>
@@ -3828,7 +3741,7 @@
                     <w:jc w:val="center"/>
                   </w:pPr>
                   <w:r>
-                    <w:t xml:space="preserve">6</w:t>
+                    <w:t xml:space="preserve">10</w:t>
                   </w:r>
                 </w:p>
               </w:tc>
@@ -3841,7 +3754,7 @@
                     <w:jc w:val="center"/>
                   </w:pPr>
                   <w:r>
-                    <w:t xml:space="preserve">10.5</w:t>
+                    <w:t xml:space="preserve">17.9</w:t>
                   </w:r>
                 </w:p>
               </w:tc>
@@ -3882,7 +3795,7 @@
                     <w:jc w:val="center"/>
                   </w:pPr>
                   <w:r>
-                    <w:t xml:space="preserve">5</w:t>
+                    <w:t xml:space="preserve">9</w:t>
                   </w:r>
                 </w:p>
               </w:tc>
@@ -3895,7 +3808,7 @@
                     <w:jc w:val="center"/>
                   </w:pPr>
                   <w:r>
-                    <w:t xml:space="preserve">8.8</w:t>
+                    <w:t xml:space="preserve">16.1</w:t>
                   </w:r>
                 </w:p>
               </w:tc>
@@ -3910,7 +3823,7 @@
                     <w:jc w:val="center"/>
                   </w:pPr>
                   <w:r>
-                    <w:t xml:space="preserve">DP7</w:t>
+                    <w:t xml:space="preserve">DP12</w:t>
                   </w:r>
                 </w:p>
               </w:tc>
@@ -3923,7 +3836,7 @@
                     <w:jc w:val="center"/>
                   </w:pPr>
                   <w:r>
-                    <w:t xml:space="preserve">Initiative / proactive</w:t>
+                    <w:t xml:space="preserve">Decision-making under pressure</w:t>
                   </w:r>
                 </w:p>
               </w:tc>
@@ -3936,7 +3849,7 @@
                     <w:jc w:val="center"/>
                   </w:pPr>
                   <w:r>
-                    <w:t xml:space="preserve">5</w:t>
+                    <w:t xml:space="preserve">8</w:t>
                   </w:r>
                 </w:p>
               </w:tc>
@@ -3949,7 +3862,7 @@
                     <w:jc w:val="center"/>
                   </w:pPr>
                   <w:r>
-                    <w:t xml:space="preserve">8.8</w:t>
+                    <w:t xml:space="preserve">14.3</w:t>
                   </w:r>
                 </w:p>
               </w:tc>
@@ -3964,7 +3877,7 @@
                     <w:jc w:val="center"/>
                   </w:pPr>
                   <w:r>
-                    <w:t xml:space="preserve">DP15</w:t>
+                    <w:t xml:space="preserve">DP7</w:t>
                   </w:r>
                 </w:p>
               </w:tc>
@@ -3977,7 +3890,7 @@
                     <w:jc w:val="center"/>
                   </w:pPr>
                   <w:r>
-                    <w:t xml:space="preserve">Self-management</w:t>
+                    <w:t xml:space="preserve">Initiative / proactive</w:t>
                   </w:r>
                 </w:p>
               </w:tc>
@@ -3990,7 +3903,7 @@
                     <w:jc w:val="center"/>
                   </w:pPr>
                   <w:r>
-                    <w:t xml:space="preserve">4</w:t>
+                    <w:t xml:space="preserve">6</w:t>
                   </w:r>
                 </w:p>
               </w:tc>
@@ -4003,7 +3916,7 @@
                     <w:jc w:val="center"/>
                   </w:pPr>
                   <w:r>
-                    <w:t xml:space="preserve">7</w:t>
+                    <w:t xml:space="preserve">10.7</w:t>
                   </w:r>
                 </w:p>
               </w:tc>
@@ -4018,7 +3931,7 @@
                     <w:jc w:val="center"/>
                   </w:pPr>
                   <w:r>
-                    <w:t xml:space="preserve">DP3</w:t>
+                    <w:t xml:space="preserve">DP10</w:t>
                   </w:r>
                 </w:p>
               </w:tc>
@@ -4031,7 +3944,7 @@
                     <w:jc w:val="center"/>
                   </w:pPr>
                   <w:r>
-                    <w:t xml:space="preserve">People-focused / caring</w:t>
+                    <w:t xml:space="preserve">Continuous improvement mindset</w:t>
                   </w:r>
                 </w:p>
               </w:tc>
@@ -4044,7 +3957,7 @@
                     <w:jc w:val="center"/>
                   </w:pPr>
                   <w:r>
-                    <w:t xml:space="preserve">4</w:t>
+                    <w:t xml:space="preserve">5</w:t>
                   </w:r>
                 </w:p>
               </w:tc>
@@ -4057,7 +3970,7 @@
                     <w:jc w:val="center"/>
                   </w:pPr>
                   <w:r>
-                    <w:t xml:space="preserve">7</w:t>
+                    <w:t xml:space="preserve">8.9</w:t>
                   </w:r>
                 </w:p>
               </w:tc>
@@ -4072,7 +3985,7 @@
                     <w:jc w:val="center"/>
                   </w:pPr>
                   <w:r>
-                    <w:t xml:space="preserve">DP10</w:t>
+                    <w:t xml:space="preserve">DP15</w:t>
                   </w:r>
                 </w:p>
               </w:tc>
@@ -4085,7 +3998,7 @@
                     <w:jc w:val="center"/>
                   </w:pPr>
                   <w:r>
-                    <w:t xml:space="preserve">Continuous improvement mindset</w:t>
+                    <w:t xml:space="preserve">Self-management</w:t>
                   </w:r>
                 </w:p>
               </w:tc>
@@ -4098,7 +4011,7 @@
                     <w:jc w:val="center"/>
                   </w:pPr>
                   <w:r>
-                    <w:t xml:space="preserve">2</w:t>
+                    <w:t xml:space="preserve">5</w:t>
                   </w:r>
                 </w:p>
               </w:tc>
@@ -4111,7 +4024,7 @@
                     <w:jc w:val="center"/>
                   </w:pPr>
                   <w:r>
-                    <w:t xml:space="preserve">3.5</w:t>
+                    <w:t xml:space="preserve">8.9</w:t>
                   </w:r>
                 </w:p>
               </w:tc>
@@ -4152,7 +4065,7 @@
                     <w:jc w:val="center"/>
                   </w:pPr>
                   <w:r>
-                    <w:t xml:space="preserve">2</w:t>
+                    <w:t xml:space="preserve">3</w:t>
                   </w:r>
                 </w:p>
               </w:tc>
@@ -4165,7 +4078,7 @@
                     <w:jc w:val="center"/>
                   </w:pPr>
                   <w:r>
-                    <w:t xml:space="preserve">3.5</w:t>
+                    <w:t xml:space="preserve">5.4</w:t>
                   </w:r>
                 </w:p>
               </w:tc>
@@ -4180,7 +4093,7 @@
                     <w:jc w:val="center"/>
                   </w:pPr>
                   <w:r>
-                    <w:t xml:space="preserve">DP9</w:t>
+                    <w:t xml:space="preserve">DP8</w:t>
                   </w:r>
                 </w:p>
               </w:tc>
@@ -4193,7 +4106,7 @@
                     <w:jc w:val="center"/>
                   </w:pPr>
                   <w:r>
-                    <w:t xml:space="preserve">Coaching/mentoring trait</w:t>
+                    <w:t xml:space="preserve">DP8</w:t>
                   </w:r>
                 </w:p>
               </w:tc>
@@ -4219,7 +4132,7 @@
                     <w:jc w:val="center"/>
                   </w:pPr>
                   <w:r>
-                    <w:t xml:space="preserve">3.5</w:t>
+                    <w:t xml:space="preserve">3.6</w:t>
                   </w:r>
                 </w:p>
               </w:tc>
@@ -4248,6 +4161,60 @@
                   </w:pPr>
                   <w:r>
                     <w:t xml:space="preserve">Inclusive leadership</w:t>
+                  </w:r>
+                </w:p>
+              </w:tc>
+              <w:tc>
+                <w:tcPr/>
+                <w:p>
+                  <w:pPr>
+                    <w:pStyle w:val="Compact"/>
+                    <w:jc w:val="right"/>
+                    <w:jc w:val="center"/>
+                  </w:pPr>
+                  <w:r>
+                    <w:t xml:space="preserve">1</w:t>
+                  </w:r>
+                </w:p>
+              </w:tc>
+              <w:tc>
+                <w:tcPr/>
+                <w:p>
+                  <w:pPr>
+                    <w:pStyle w:val="Compact"/>
+                    <w:jc w:val="right"/>
+                    <w:jc w:val="center"/>
+                  </w:pPr>
+                  <w:r>
+                    <w:t xml:space="preserve">1.8</w:t>
+                  </w:r>
+                </w:p>
+              </w:tc>
+            </w:tr>
+            <w:tr>
+              <w:tc>
+                <w:tcPr/>
+                <w:p>
+                  <w:pPr>
+                    <w:pStyle w:val="Compact"/>
+                    <w:jc w:val="left"/>
+                    <w:jc w:val="center"/>
+                  </w:pPr>
+                  <w:r>
+                    <w:t xml:space="preserve">DP9</w:t>
+                  </w:r>
+                </w:p>
+              </w:tc>
+              <w:tc>
+                <w:tcPr/>
+                <w:p>
+                  <w:pPr>
+                    <w:pStyle w:val="Compact"/>
+                    <w:jc w:val="left"/>
+                    <w:jc w:val="center"/>
+                  </w:pPr>
+                  <w:r>
+                    <w:t xml:space="preserve">Coaching/mentoring trait</w:t>
                   </w:r>
                 </w:p>
               </w:tc>
@@ -4329,7 +4296,7 @@
             <w:r>
               <w:drawing>
                 <wp:inline>
-                  <wp:extent cx="5073650" cy="2702530"/>
+                  <wp:extent cx="5073650" cy="3826377"/>
                   <wp:effectExtent b="0" l="0" r="0" t="0"/>
                   <wp:docPr descr="" title="" id="43" name="Picture"/>
                   <a:graphic>
@@ -4350,7 +4317,7 @@
                         <pic:spPr bwMode="auto">
                           <a:xfrm>
                             <a:off x="0" y="0"/>
-                            <a:ext cx="5073650" cy="2702530"/>
+                            <a:ext cx="5073650" cy="3826377"/>
                           </a:xfrm>
                           <a:prstGeom prst="rect">
                             <a:avLst/>
@@ -4379,7 +4346,7 @@
               <w:pStyle w:val="ImageCaption"/>
             </w:pPr>
             <w:r>
-              <w:t xml:space="preserve">Figure 3: Top dispositions across 57 JDs</w:t>
+              <w:t xml:space="preserve">Figure 3: Top dispositions across 56 JDs</w:t>
             </w:r>
           </w:p>
           <w:bookmarkEnd w:id="45"/>
@@ -4407,7 +4374,7 @@
         </w:numPr>
       </w:pPr>
       <w:r>
-        <w:t xml:space="preserve">DP2 (strong communicator) appears in 31 JDs (54%), the highest count in this category.</w:t>
+        <w:t xml:space="preserve">DP2 (strong communicator) appears in 28 JDs (50%), the highest count in this category.</w:t>
       </w:r>
     </w:p>
     <w:p>
@@ -4419,7 +4386,7 @@
         </w:numPr>
       </w:pPr>
       <w:r>
-        <w:t xml:space="preserve">DP1 (safety-focused) appears in 21 JDs (37%).</w:t>
+        <w:t xml:space="preserve">DP1 (safety-focused) appears in 22 JDs (39%).</w:t>
       </w:r>
     </w:p>
     <w:p>
@@ -4431,7 +4398,7 @@
         </w:numPr>
       </w:pPr>
       <w:r>
-        <w:t xml:space="preserve">DP14 (relationship-building or stakeholder management) appears in 13 JDs (22%) and DP6 (problem-solver or analytical) in 12 JDs (21%).</w:t>
+        <w:t xml:space="preserve">DP14 (relationship-building or stakeholder management) and DP5 (hands-on or front-line leadership) are tied at 14 JDs (25%); DP3 (people-focused / caring) in 13 (23%); DP6 (problem-solver or analytical) in 12 (21%).</w:t>
       </w:r>
     </w:p>
     <w:p>
@@ -4443,7 +4410,7 @@
         </w:numPr>
       </w:pPr>
       <w:r>
-        <w:t xml:space="preserve">DP9 (coaching or mentoring orientation as a trait) appears in 2 JDs (3%). D2 (coach, mentor and develop) as a duty appears in 29 JDs (49%). JDs more often frame mentoring as an action than as a trait.</w:t>
+        <w:t xml:space="preserve">DP9 (coaching or mentoring orientation as a trait) appears in only 1 JD. D2 (coach, mentor and develop) as a duty appears in 31 JDs (55%). JDs almost always frame mentoring as an action rather than as a trait.</w:t>
       </w:r>
     </w:p>
     <w:p>
@@ -4455,7 +4422,7 @@
         </w:numPr>
       </w:pPr>
       <w:r>
-        <w:t xml:space="preserve">DP16 (inclusive leadership) appears in 1 JD (Goonyella Blast Crew Supervisor BMA).</w:t>
+        <w:t xml:space="preserve">DP16 (inclusive leadership) appears in 1 JD (Supervisor Blast Crew Goonyella Mine BMA).</w:t>
       </w:r>
     </w:p>
     <w:tbl>
@@ -4495,7 +4462,7 @@
             <w:r>
               <w:drawing>
                 <wp:inline>
-                  <wp:extent cx="5372100" cy="3252075"/>
+                  <wp:extent cx="5372100" cy="5181838"/>
                   <wp:effectExtent b="0" l="0" r="0" t="0"/>
                   <wp:docPr descr="" title="" id="47" name="Picture"/>
                   <a:graphic>
@@ -4516,7 +4483,7 @@
                         <pic:spPr bwMode="auto">
                           <a:xfrm>
                             <a:off x="0" y="0"/>
-                            <a:ext cx="5372100" cy="3252075"/>
+                            <a:ext cx="5372100" cy="5181838"/>
                           </a:xfrm>
                           <a:prstGeom prst="rect">
                             <a:avLst/>
@@ -4601,7 +4568,7 @@
               <w:pStyle w:val="ImageCaption"/>
             </w:pPr>
             <w:r>
-              <w:t xml:space="preserve">Table 5: Qualifications: frequency across all 57 JDs</w:t>
+              <w:t xml:space="preserve">Table 5: Qualifications: frequency across all 56 JDs</w:t>
             </w:r>
           </w:p>
           <w:tbl>
@@ -4722,7 +4689,7 @@
                     <w:jc w:val="center"/>
                   </w:pPr>
                   <w:r>
-                    <w:t xml:space="preserve">31.6</w:t>
+                    <w:t xml:space="preserve">32.1</w:t>
                   </w:r>
                 </w:p>
               </w:tc>
@@ -4776,7 +4743,7 @@
                     <w:jc w:val="center"/>
                   </w:pPr>
                   <w:r>
-                    <w:t xml:space="preserve">29.8</w:t>
+                    <w:t xml:space="preserve">30.4</w:t>
                   </w:r>
                 </w:p>
               </w:tc>
@@ -4817,7 +4784,7 @@
                     <w:jc w:val="center"/>
                   </w:pPr>
                   <w:r>
-                    <w:t xml:space="preserve">12</w:t>
+                    <w:t xml:space="preserve">15</w:t>
                   </w:r>
                 </w:p>
               </w:tc>
@@ -4830,7 +4797,7 @@
                     <w:jc w:val="center"/>
                   </w:pPr>
                   <w:r>
-                    <w:t xml:space="preserve">21.1</w:t>
+                    <w:t xml:space="preserve">26.8</w:t>
                   </w:r>
                 </w:p>
               </w:tc>
@@ -4871,7 +4838,7 @@
                     <w:jc w:val="center"/>
                   </w:pPr>
                   <w:r>
-                    <w:t xml:space="preserve">11</w:t>
+                    <w:t xml:space="preserve">12</w:t>
                   </w:r>
                 </w:p>
               </w:tc>
@@ -4884,7 +4851,7 @@
                     <w:jc w:val="center"/>
                   </w:pPr>
                   <w:r>
-                    <w:t xml:space="preserve">19.3</w:t>
+                    <w:t xml:space="preserve">21.4</w:t>
                   </w:r>
                 </w:p>
               </w:tc>
@@ -4899,7 +4866,7 @@
                     <w:jc w:val="center"/>
                   </w:pPr>
                   <w:r>
-                    <w:t xml:space="preserve">Q3</w:t>
+                    <w:t xml:space="preserve">Q5</w:t>
                   </w:r>
                 </w:p>
               </w:tc>
@@ -4912,7 +4879,7 @@
                     <w:jc w:val="center"/>
                   </w:pPr>
                   <w:r>
-                    <w:t xml:space="preserve">Coal UG G1/G8/G9</w:t>
+                    <w:t xml:space="preserve">Minerals/Quarry QMS123/G189</w:t>
                   </w:r>
                 </w:p>
               </w:tc>
@@ -4925,7 +4892,7 @@
                     <w:jc w:val="center"/>
                   </w:pPr>
                   <w:r>
-                    <w:t xml:space="preserve">8</w:t>
+                    <w:t xml:space="preserve">11</w:t>
                   </w:r>
                 </w:p>
               </w:tc>
@@ -4938,7 +4905,7 @@
                     <w:jc w:val="center"/>
                   </w:pPr>
                   <w:r>
-                    <w:t xml:space="preserve">14</w:t>
+                    <w:t xml:space="preserve">19.6</w:t>
                   </w:r>
                 </w:p>
               </w:tc>
@@ -4953,7 +4920,7 @@
                     <w:jc w:val="center"/>
                   </w:pPr>
                   <w:r>
-                    <w:t xml:space="preserve">Q5</w:t>
+                    <w:t xml:space="preserve">Q6</w:t>
                   </w:r>
                 </w:p>
               </w:tc>
@@ -4966,7 +4933,7 @@
                     <w:jc w:val="center"/>
                   </w:pPr>
                   <w:r>
-                    <w:t xml:space="preserve">Minerals/Quarry QMS123/G189</w:t>
+                    <w:t xml:space="preserve">Coal Board Medical</w:t>
                   </w:r>
                 </w:p>
               </w:tc>
@@ -4979,7 +4946,7 @@
                     <w:jc w:val="center"/>
                   </w:pPr>
                   <w:r>
-                    <w:t xml:space="preserve">6</w:t>
+                    <w:t xml:space="preserve">8</w:t>
                   </w:r>
                 </w:p>
               </w:tc>
@@ -4992,7 +4959,7 @@
                     <w:jc w:val="center"/>
                   </w:pPr>
                   <w:r>
-                    <w:t xml:space="preserve">10.5</w:t>
+                    <w:t xml:space="preserve">14.3</w:t>
                   </w:r>
                 </w:p>
               </w:tc>
@@ -5007,7 +4974,7 @@
                     <w:jc w:val="center"/>
                   </w:pPr>
                   <w:r>
-                    <w:t xml:space="preserve">Q6</w:t>
+                    <w:t xml:space="preserve">Q8</w:t>
                   </w:r>
                 </w:p>
               </w:tc>
@@ -5020,7 +4987,7 @@
                     <w:jc w:val="center"/>
                   </w:pPr>
                   <w:r>
-                    <w:t xml:space="preserve">Coal Board Medical</w:t>
+                    <w:t xml:space="preserve">RII units (named)</w:t>
                   </w:r>
                 </w:p>
               </w:tc>
@@ -5033,7 +5000,7 @@
                     <w:jc w:val="center"/>
                   </w:pPr>
                   <w:r>
-                    <w:t xml:space="preserve">6</w:t>
+                    <w:t xml:space="preserve">7</w:t>
                   </w:r>
                 </w:p>
               </w:tc>
@@ -5046,7 +5013,7 @@
                     <w:jc w:val="center"/>
                   </w:pPr>
                   <w:r>
-                    <w:t xml:space="preserve">10.5</w:t>
+                    <w:t xml:space="preserve">12.5</w:t>
                   </w:r>
                 </w:p>
               </w:tc>
@@ -5061,7 +5028,7 @@
                     <w:jc w:val="center"/>
                   </w:pPr>
                   <w:r>
-                    <w:t xml:space="preserve">Q8</w:t>
+                    <w:t xml:space="preserve">Q17</w:t>
                   </w:r>
                 </w:p>
               </w:tc>
@@ -5074,7 +5041,7 @@
                     <w:jc w:val="center"/>
                   </w:pPr>
                   <w:r>
-                    <w:t xml:space="preserve">RII units (named)</w:t>
+                    <w:t xml:space="preserve">VOC for equipment</w:t>
                   </w:r>
                 </w:p>
               </w:tc>
@@ -5087,7 +5054,7 @@
                     <w:jc w:val="center"/>
                   </w:pPr>
                   <w:r>
-                    <w:t xml:space="preserve">6</w:t>
+                    <w:t xml:space="preserve">5</w:t>
                   </w:r>
                 </w:p>
               </w:tc>
@@ -5100,7 +5067,7 @@
                     <w:jc w:val="center"/>
                   </w:pPr>
                   <w:r>
-                    <w:t xml:space="preserve">10.5</w:t>
+                    <w:t xml:space="preserve">8.9</w:t>
                   </w:r>
                 </w:p>
               </w:tc>
@@ -5154,7 +5121,7 @@
                     <w:jc w:val="center"/>
                   </w:pPr>
                   <w:r>
-                    <w:t xml:space="preserve">8.8</w:t>
+                    <w:t xml:space="preserve">8.9</w:t>
                   </w:r>
                 </w:p>
               </w:tc>
@@ -5208,7 +5175,7 @@
                     <w:jc w:val="center"/>
                   </w:pPr>
                   <w:r>
-                    <w:t xml:space="preserve">7</w:t>
+                    <w:t xml:space="preserve">7.1</w:t>
                   </w:r>
                 </w:p>
               </w:tc>
@@ -5262,7 +5229,7 @@
                     <w:jc w:val="center"/>
                   </w:pPr>
                   <w:r>
-                    <w:t xml:space="preserve">5.3</w:t>
+                    <w:t xml:space="preserve">5.4</w:t>
                   </w:r>
                 </w:p>
               </w:tc>
@@ -5316,7 +5283,7 @@
                     <w:jc w:val="center"/>
                   </w:pPr>
                   <w:r>
-                    <w:t xml:space="preserve">5.3</w:t>
+                    <w:t xml:space="preserve">5.4</w:t>
                   </w:r>
                 </w:p>
               </w:tc>
@@ -5331,7 +5298,7 @@
                     <w:jc w:val="center"/>
                   </w:pPr>
                   <w:r>
-                    <w:t xml:space="preserve">Q17</w:t>
+                    <w:t xml:space="preserve">Q16</w:t>
                   </w:r>
                 </w:p>
               </w:tc>
@@ -5344,7 +5311,7 @@
                     <w:jc w:val="center"/>
                   </w:pPr>
                   <w:r>
-                    <w:t xml:space="preserve">VOC for equipment</w:t>
+                    <w:t xml:space="preserve">Generic Site Induction</w:t>
                   </w:r>
                 </w:p>
               </w:tc>
@@ -5370,7 +5337,7 @@
                     <w:jc w:val="center"/>
                   </w:pPr>
                   <w:r>
-                    <w:t xml:space="preserve">5.3</w:t>
+                    <w:t xml:space="preserve">5.4</w:t>
                   </w:r>
                 </w:p>
               </w:tc>
@@ -5424,7 +5391,7 @@
                     <w:jc w:val="center"/>
                   </w:pPr>
                   <w:r>
-                    <w:t xml:space="preserve">5.3</w:t>
+                    <w:t xml:space="preserve">5.4</w:t>
                   </w:r>
                 </w:p>
               </w:tc>
@@ -5439,7 +5406,7 @@
                     <w:jc w:val="center"/>
                   </w:pPr>
                   <w:r>
-                    <w:t xml:space="preserve">Q14</w:t>
+                    <w:t xml:space="preserve">Q3</w:t>
                   </w:r>
                 </w:p>
               </w:tc>
@@ -5452,7 +5419,7 @@
                     <w:jc w:val="center"/>
                   </w:pPr>
                   <w:r>
-                    <w:t xml:space="preserve">MSIC</w:t>
+                    <w:t xml:space="preserve">Coal UG G1/G8/G9</w:t>
                   </w:r>
                 </w:p>
               </w:tc>
@@ -5478,7 +5445,7 @@
                     <w:jc w:val="center"/>
                   </w:pPr>
                   <w:r>
-                    <w:t xml:space="preserve">3.5</w:t>
+                    <w:t xml:space="preserve">3.6</w:t>
                   </w:r>
                 </w:p>
               </w:tc>
@@ -5493,7 +5460,7 @@
                     <w:jc w:val="center"/>
                   </w:pPr>
                   <w:r>
-                    <w:t xml:space="preserve">Q16</w:t>
+                    <w:t xml:space="preserve">Q13</w:t>
                   </w:r>
                 </w:p>
               </w:tc>
@@ -5506,7 +5473,7 @@
                     <w:jc w:val="center"/>
                   </w:pPr>
                   <w:r>
-                    <w:t xml:space="preserve">Generic Site Induction</w:t>
+                    <w:t xml:space="preserve">White Card</w:t>
                   </w:r>
                 </w:p>
               </w:tc>
@@ -5519,7 +5486,7 @@
                     <w:jc w:val="center"/>
                   </w:pPr>
                   <w:r>
-                    <w:t xml:space="preserve">2</w:t>
+                    <w:t xml:space="preserve">1</w:t>
                   </w:r>
                 </w:p>
               </w:tc>
@@ -5532,7 +5499,7 @@
                     <w:jc w:val="center"/>
                   </w:pPr>
                   <w:r>
-                    <w:t xml:space="preserve">3.5</w:t>
+                    <w:t xml:space="preserve">1.8</w:t>
                   </w:r>
                 </w:p>
               </w:tc>
@@ -5547,7 +5514,7 @@
                     <w:jc w:val="center"/>
                   </w:pPr>
                   <w:r>
-                    <w:t xml:space="preserve">Q13</w:t>
+                    <w:t xml:space="preserve">Q14</w:t>
                   </w:r>
                 </w:p>
               </w:tc>
@@ -5560,7 +5527,7 @@
                     <w:jc w:val="center"/>
                   </w:pPr>
                   <w:r>
-                    <w:t xml:space="preserve">White Card</w:t>
+                    <w:t xml:space="preserve">MSIC</w:t>
                   </w:r>
                 </w:p>
               </w:tc>
@@ -5804,7 +5771,7 @@
             <w:r>
               <w:drawing>
                 <wp:inline>
-                  <wp:extent cx="5073650" cy="2702530"/>
+                  <wp:extent cx="5073650" cy="3826377"/>
                   <wp:effectExtent b="0" l="0" r="0" t="0"/>
                   <wp:docPr descr="" title="" id="53" name="Picture"/>
                   <a:graphic>
@@ -5825,7 +5792,7 @@
                         <pic:spPr bwMode="auto">
                           <a:xfrm>
                             <a:off x="0" y="0"/>
-                            <a:ext cx="5073650" cy="2702530"/>
+                            <a:ext cx="5073650" cy="3826377"/>
                           </a:xfrm>
                           <a:prstGeom prst="rect">
                             <a:avLst/>
@@ -5854,7 +5821,7 @@
               <w:pStyle w:val="ImageCaption"/>
             </w:pPr>
             <w:r>
-              <w:t xml:space="preserve">Figure 5: Top qualifications across 57 JDs</w:t>
+              <w:t xml:space="preserve">Figure 5: Top qualifications across 56 JDs</w:t>
             </w:r>
           </w:p>
           <w:bookmarkEnd w:id="55"/>
@@ -5906,7 +5873,7 @@
         </w:numPr>
       </w:pPr>
       <w:r>
-        <w:t xml:space="preserve">Standard 11 (Q1) appears in 11 JDs (19%) and the Coal Surface statutory ticket set S1/S2/S3/G2 (Q2) in 12 JDs (21%).</w:t>
+        <w:t xml:space="preserve">Coal Surface supervisor competencies S1/S2/S3/G2 (Q2) appear in 15 JDs (27%) and Standard 11 (Q1) in 12 JDs (21%).</w:t>
       </w:r>
     </w:p>
     <w:p>
@@ -5918,7 +5885,7 @@
         </w:numPr>
       </w:pPr>
       <w:r>
-        <w:t xml:space="preserve">Coal Underground supervisor competencies (Q3, G1/G8/G9 with G2) appear in 8 JDs (14%).</w:t>
+        <w:t xml:space="preserve">Minerals and Quarry supervisor competencies QMS123/G189 (Q5) appear in 11 JDs (20%).</w:t>
       </w:r>
     </w:p>
     <w:p>
@@ -5930,7 +5897,7 @@
         </w:numPr>
       </w:pPr>
       <w:r>
-        <w:t xml:space="preserve">Minerals and Quarry supervisor competencies QMS123/G189 (Q5) appear in 6 JDs (10%).</w:t>
+        <w:t xml:space="preserve">Coal Underground supervisor competencies (Q3, G1/G8/G9 with G2) appear in only 2 JDs (4%), reflecting the small Coal UG share of the in-scope corpus (3 JDs).</w:t>
       </w:r>
     </w:p>
     <w:p>
@@ -5942,7 +5909,7 @@
         </w:numPr>
       </w:pPr>
       <w:r>
-        <w:t xml:space="preserve">Open Cut Examiner (Q4) is explicitly named in 3 JDs (5%): Foxleigh Mine, Golding OCE Kogan, and Anglo Production Supervisor Dawson (listed as desirable).</w:t>
+        <w:t xml:space="preserve">QLD Coal Board Medical / ResHealth (Q6) appears in 8 JDs (14%); named RII units (Q8) in 7 (12%); First Aid (Q7) and VOC for named equipment (Q17) each in 5 (9%); High Risk Work Licences (Q12) in 4 (7%).</w:t>
       </w:r>
     </w:p>
     <w:p>
@@ -5954,7 +5921,7 @@
         </w:numPr>
       </w:pPr>
       <w:r>
-        <w:t xml:space="preserve">High Risk Work Licences (Q12) appear in 4 JDs (7%); Cert IV in Training and Assessment (Q18) in 3 JDs (5%); MSIC (Q14), Generic Site Induction (Q16) and Engineering tertiary (Q10) each in 2-3 JDs.</w:t>
+        <w:t xml:space="preserve">Open Cut Examiner (Q4) is explicitly named in 3 JDs (5%): Foxleigh Mine, Golding OCE Kogan, and Anglo Production Supervisor Dawson (listed as desirable).</w:t>
       </w:r>
     </w:p>
     <w:p>
@@ -5966,7 +5933,7 @@
         </w:numPr>
       </w:pPr>
       <w:r>
-        <w:t xml:space="preserve">Niche credentials each appearing in 1 JD: White Card (Q13), Explosives Security Clearance (Q15), Shotfirer accreditation (Q20), and Frontline Management certification (Q19).</w:t>
+        <w:t xml:space="preserve">Niche credentials each appearing in 1 JD: White Card (Q13), MSIC (Q14), Explosives Security Clearance (Q15), Shotfirer accreditation (Q20), and Frontline Management certification (Q19).</w:t>
       </w:r>
     </w:p>
     <w:tbl>
@@ -6006,7 +5973,7 @@
             <w:r>
               <w:drawing>
                 <wp:inline>
-                  <wp:extent cx="5372100" cy="3274659"/>
+                  <wp:extent cx="5372100" cy="6312217"/>
                   <wp:effectExtent b="0" l="0" r="0" t="0"/>
                   <wp:docPr descr="" title="" id="57" name="Picture"/>
                   <a:graphic>
@@ -6027,7 +5994,7 @@
                         <pic:spPr bwMode="auto">
                           <a:xfrm>
                             <a:off x="0" y="0"/>
-                            <a:ext cx="5372100" cy="3274659"/>
+                            <a:ext cx="5372100" cy="6312217"/>
                           </a:xfrm>
                           <a:prstGeom prst="rect">
                             <a:avLst/>
@@ -6112,7 +6079,7 @@
               <w:pStyle w:val="ImageCaption"/>
             </w:pPr>
             <w:r>
-              <w:t xml:space="preserve">Table 6: Knowledge codes: frequency across all 57 JDs</w:t>
+              <w:t xml:space="preserve">Table 6: Knowledge codes: frequency across all 56 JDs</w:t>
             </w:r>
           </w:p>
           <w:tbl>
@@ -6220,7 +6187,7 @@
                     <w:jc w:val="center"/>
                   </w:pPr>
                   <w:r>
-                    <w:t xml:space="preserve">19</w:t>
+                    <w:t xml:space="preserve">18</w:t>
                   </w:r>
                 </w:p>
               </w:tc>
@@ -6233,7 +6200,7 @@
                     <w:jc w:val="center"/>
                   </w:pPr>
                   <w:r>
-                    <w:t xml:space="preserve">33.3</w:t>
+                    <w:t xml:space="preserve">32.1</w:t>
                   </w:r>
                 </w:p>
               </w:tc>
@@ -6248,7 +6215,7 @@
                     <w:jc w:val="center"/>
                   </w:pPr>
                   <w:r>
-                    <w:t xml:space="preserve">K4</w:t>
+                    <w:t xml:space="preserve">K1</w:t>
                   </w:r>
                 </w:p>
               </w:tc>
@@ -6261,7 +6228,7 @@
                     <w:jc w:val="center"/>
                   </w:pPr>
                   <w:r>
-                    <w:t xml:space="preserve">Equipment / plant knowledge</w:t>
+                    <w:t xml:space="preserve">QLD CMSHA knowledge</w:t>
                   </w:r>
                 </w:p>
               </w:tc>
@@ -6274,7 +6241,7 @@
                     <w:jc w:val="center"/>
                   </w:pPr>
                   <w:r>
-                    <w:t xml:space="preserve">12</w:t>
+                    <w:t xml:space="preserve">13</w:t>
                   </w:r>
                 </w:p>
               </w:tc>
@@ -6287,7 +6254,7 @@
                     <w:jc w:val="center"/>
                   </w:pPr>
                   <w:r>
-                    <w:t xml:space="preserve">21.1</w:t>
+                    <w:t xml:space="preserve">23.2</w:t>
                   </w:r>
                 </w:p>
               </w:tc>
@@ -6302,7 +6269,7 @@
                     <w:jc w:val="center"/>
                   </w:pPr>
                   <w:r>
-                    <w:t xml:space="preserve">K1</w:t>
+                    <w:t xml:space="preserve">K6</w:t>
                   </w:r>
                 </w:p>
               </w:tc>
@@ -6315,7 +6282,7 @@
                     <w:jc w:val="center"/>
                   </w:pPr>
                   <w:r>
-                    <w:t xml:space="preserve">QLD CMSHA knowledge</w:t>
+                    <w:t xml:space="preserve">Risk management methodology</w:t>
                   </w:r>
                 </w:p>
               </w:tc>
@@ -6328,7 +6295,7 @@
                     <w:jc w:val="center"/>
                   </w:pPr>
                   <w:r>
-                    <w:t xml:space="preserve">8</w:t>
+                    <w:t xml:space="preserve">12</w:t>
                   </w:r>
                 </w:p>
               </w:tc>
@@ -6341,7 +6308,7 @@
                     <w:jc w:val="center"/>
                   </w:pPr>
                   <w:r>
-                    <w:t xml:space="preserve">14</w:t>
+                    <w:t xml:space="preserve">21.4</w:t>
                   </w:r>
                 </w:p>
               </w:tc>
@@ -6356,7 +6323,7 @@
                     <w:jc w:val="center"/>
                   </w:pPr>
                   <w:r>
-                    <w:t xml:space="preserve">K8</w:t>
+                    <w:t xml:space="preserve">K4</w:t>
                   </w:r>
                 </w:p>
               </w:tc>
@@ -6369,7 +6336,7 @@
                     <w:jc w:val="center"/>
                   </w:pPr>
                   <w:r>
-                    <w:t xml:space="preserve">Sector technical knowledge</w:t>
+                    <w:t xml:space="preserve">Equipment / plant knowledge</w:t>
                   </w:r>
                 </w:p>
               </w:tc>
@@ -6382,7 +6349,7 @@
                     <w:jc w:val="center"/>
                   </w:pPr>
                   <w:r>
-                    <w:t xml:space="preserve">7</w:t>
+                    <w:t xml:space="preserve">10</w:t>
                   </w:r>
                 </w:p>
               </w:tc>
@@ -6395,7 +6362,7 @@
                     <w:jc w:val="center"/>
                   </w:pPr>
                   <w:r>
-                    <w:t xml:space="preserve">12.3</w:t>
+                    <w:t xml:space="preserve">17.9</w:t>
                   </w:r>
                 </w:p>
               </w:tc>
@@ -6410,7 +6377,7 @@
                     <w:jc w:val="center"/>
                   </w:pPr>
                   <w:r>
-                    <w:t xml:space="preserve">K6</w:t>
+                    <w:t xml:space="preserve">K8</w:t>
                   </w:r>
                 </w:p>
               </w:tc>
@@ -6423,7 +6390,7 @@
                     <w:jc w:val="center"/>
                   </w:pPr>
                   <w:r>
-                    <w:t xml:space="preserve">Risk management methodology</w:t>
+                    <w:t xml:space="preserve">Sector technical knowledge</w:t>
                   </w:r>
                 </w:p>
               </w:tc>
@@ -6436,7 +6403,7 @@
                     <w:jc w:val="center"/>
                   </w:pPr>
                   <w:r>
-                    <w:t xml:space="preserve">6</w:t>
+                    <w:t xml:space="preserve">7</w:t>
                   </w:r>
                 </w:p>
               </w:tc>
@@ -6449,7 +6416,7 @@
                     <w:jc w:val="center"/>
                   </w:pPr>
                   <w:r>
-                    <w:t xml:space="preserve">10.5</w:t>
+                    <w:t xml:space="preserve">12.5</w:t>
                   </w:r>
                 </w:p>
               </w:tc>
@@ -6490,7 +6457,7 @@
                     <w:jc w:val="center"/>
                   </w:pPr>
                   <w:r>
-                    <w:t xml:space="preserve">4</w:t>
+                    <w:t xml:space="preserve">7</w:t>
                   </w:r>
                 </w:p>
               </w:tc>
@@ -6503,7 +6470,7 @@
                     <w:jc w:val="center"/>
                   </w:pPr>
                   <w:r>
-                    <w:t xml:space="preserve">7</w:t>
+                    <w:t xml:space="preserve">12.5</w:t>
                   </w:r>
                 </w:p>
               </w:tc>
@@ -6518,6 +6485,60 @@
                     <w:jc w:val="center"/>
                   </w:pPr>
                   <w:r>
+                    <w:t xml:space="preserve">K2</w:t>
+                  </w:r>
+                </w:p>
+              </w:tc>
+              <w:tc>
+                <w:tcPr/>
+                <w:p>
+                  <w:pPr>
+                    <w:pStyle w:val="Compact"/>
+                    <w:jc w:val="left"/>
+                    <w:jc w:val="center"/>
+                  </w:pPr>
+                  <w:r>
+                    <w:t xml:space="preserve">K2</w:t>
+                  </w:r>
+                </w:p>
+              </w:tc>
+              <w:tc>
+                <w:tcPr/>
+                <w:p>
+                  <w:pPr>
+                    <w:pStyle w:val="Compact"/>
+                    <w:jc w:val="right"/>
+                    <w:jc w:val="center"/>
+                  </w:pPr>
+                  <w:r>
+                    <w:t xml:space="preserve">4</w:t>
+                  </w:r>
+                </w:p>
+              </w:tc>
+              <w:tc>
+                <w:tcPr/>
+                <w:p>
+                  <w:pPr>
+                    <w:pStyle w:val="Compact"/>
+                    <w:jc w:val="right"/>
+                    <w:jc w:val="center"/>
+                  </w:pPr>
+                  <w:r>
+                    <w:t xml:space="preserve">7.1</w:t>
+                  </w:r>
+                </w:p>
+              </w:tc>
+            </w:tr>
+            <w:tr>
+              <w:tc>
+                <w:tcPr/>
+                <w:p>
+                  <w:pPr>
+                    <w:pStyle w:val="Compact"/>
+                    <w:jc w:val="left"/>
+                    <w:jc w:val="center"/>
+                  </w:pPr>
+                  <w:r>
                     <w:t xml:space="preserve">K7</w:t>
                   </w:r>
                 </w:p>
@@ -6557,7 +6578,7 @@
                     <w:jc w:val="center"/>
                   </w:pPr>
                   <w:r>
-                    <w:t xml:space="preserve">3.5</w:t>
+                    <w:t xml:space="preserve">3.6</w:t>
                   </w:r>
                 </w:p>
               </w:tc>
@@ -6721,7 +6742,7 @@
             <w:r>
               <w:drawing>
                 <wp:inline>
-                  <wp:extent cx="5073650" cy="2008960"/>
+                  <wp:extent cx="5073650" cy="3297872"/>
                   <wp:effectExtent b="0" l="0" r="0" t="0"/>
                   <wp:docPr descr="" title="" id="63" name="Picture"/>
                   <a:graphic>
@@ -6742,7 +6763,7 @@
                         <pic:spPr bwMode="auto">
                           <a:xfrm>
                             <a:off x="0" y="0"/>
-                            <a:ext cx="5073650" cy="2008960"/>
+                            <a:ext cx="5073650" cy="3297872"/>
                           </a:xfrm>
                           <a:prstGeom prst="rect">
                             <a:avLst/>
@@ -6771,7 +6792,7 @@
               <w:pStyle w:val="ImageCaption"/>
             </w:pPr>
             <w:r>
-              <w:t xml:space="preserve">Figure 7: Top knowledge codes across 57 JDs</w:t>
+              <w:t xml:space="preserve">Figure 7: Top knowledge codes across 56 JDs</w:t>
             </w:r>
           </w:p>
           <w:bookmarkEnd w:id="65"/>
@@ -6799,7 +6820,7 @@
         </w:numPr>
       </w:pPr>
       <w:r>
-        <w:t xml:space="preserve">K5 (operational systems or software knowledge) appears in 19 JDs (33%), the most-named knowledge code. Specific systems named across the corpus include Microsoft Office, SAP, PRONTO, INX, Ellipse, CMMS, and Microsoft Project.</w:t>
+        <w:t xml:space="preserve">K5 (operational systems or software knowledge) appears in 18 JDs (32%), the most-named knowledge code. Specific systems named across the corpus include Microsoft Office, SAP, PRONTO, INX, Ellipse, CMMS, and Microsoft Project.</w:t>
       </w:r>
     </w:p>
     <w:p>
@@ -6811,7 +6832,7 @@
         </w:numPr>
       </w:pPr>
       <w:r>
-        <w:t xml:space="preserve">K4 (equipment or plant knowledge) appears in 12 JDs (21%).</w:t>
+        <w:t xml:space="preserve">K1 (QLD CMSHA legislative knowledge) appears in 13 JDs (23%).</w:t>
       </w:r>
     </w:p>
     <w:p>
@@ -6823,7 +6844,7 @@
         </w:numPr>
       </w:pPr>
       <w:r>
-        <w:t xml:space="preserve">K1 (QLD CMSHA legislative knowledge) appears in 8 JDs (14%) and K8 (sector-specific technical knowledge) in 7 JDs (12%).</w:t>
+        <w:t xml:space="preserve">K6 (risk management methodology) appears in 12 JDs (21%) and K4 (equipment or plant knowledge) in 10 JDs (18%).</w:t>
       </w:r>
     </w:p>
     <w:p>
@@ -6835,7 +6856,7 @@
         </w:numPr>
       </w:pPr>
       <w:r>
-        <w:t xml:space="preserve">K6 (risk management methodology) appears in 6 JDs (10%).</w:t>
+        <w:t xml:space="preserve">K8 (sector-specific technical knowledge) and K9 (maintenance planning, scheduling, condition monitoring) each appear in 7 JDs (12%).</w:t>
       </w:r>
     </w:p>
     <w:p>
@@ -6847,7 +6868,19 @@
         </w:numPr>
       </w:pPr>
       <w:r>
-        <w:t xml:space="preserve">K7 (continuous improvement methodology such as LEAN) appears in 2 JDs (3%): both Boral Quarry sites.</w:t>
+        <w:t xml:space="preserve">K7 (continuous improvement methodology such as LEAN) appears in 2 JDs (4%): both Boral Quarry sites.</w:t>
+      </w:r>
+    </w:p>
+    <w:p>
+      <w:pPr>
+        <w:pStyle w:val="Compact"/>
+        <w:numPr>
+          <w:ilvl w:val="0"/>
+          <w:numId w:val="1008"/>
+        </w:numPr>
+      </w:pPr>
+      <w:r>
+        <w:t xml:space="preserve">K3 (electrical installation legislation) and K10 (product specifications) each appear in 1 JD.</w:t>
       </w:r>
     </w:p>
     <w:tbl>
@@ -6887,7 +6920,7 @@
             <w:r>
               <w:drawing>
                 <wp:inline>
-                  <wp:extent cx="5372100" cy="2439223"/>
+                  <wp:extent cx="5372100" cy="3491865"/>
                   <wp:effectExtent b="0" l="0" r="0" t="0"/>
                   <wp:docPr descr="" title="" id="67" name="Picture"/>
                   <a:graphic>
@@ -6908,7 +6941,7 @@
                         <pic:spPr bwMode="auto">
                           <a:xfrm>
                             <a:off x="0" y="0"/>
-                            <a:ext cx="5372100" cy="2439223"/>
+                            <a:ext cx="5372100" cy="3491865"/>
                           </a:xfrm>
                           <a:prstGeom prst="rect">
                             <a:avLst/>
@@ -6993,7 +7026,7 @@
               <w:pStyle w:val="ImageCaption"/>
             </w:pPr>
             <w:r>
-              <w:t xml:space="preserve">Table 7: Experience codes: frequency across all 57 JDs</w:t>
+              <w:t xml:space="preserve">Table 7: Experience codes: frequency across all 56 JDs</w:t>
             </w:r>
           </w:p>
           <w:tbl>
@@ -7101,7 +7134,7 @@
                     <w:jc w:val="center"/>
                   </w:pPr>
                   <w:r>
-                    <w:t xml:space="preserve">43</w:t>
+                    <w:t xml:space="preserve">46</w:t>
                   </w:r>
                 </w:p>
               </w:tc>
@@ -7114,7 +7147,7 @@
                     <w:jc w:val="center"/>
                   </w:pPr>
                   <w:r>
-                    <w:t xml:space="preserve">75.4</w:t>
+                    <w:t xml:space="preserve">82.1</w:t>
                   </w:r>
                 </w:p>
               </w:tc>
@@ -7155,7 +7188,7 @@
                     <w:jc w:val="center"/>
                   </w:pPr>
                   <w:r>
-                    <w:t xml:space="preserve">17</w:t>
+                    <w:t xml:space="preserve">30</w:t>
                   </w:r>
                 </w:p>
               </w:tc>
@@ -7168,7 +7201,7 @@
                     <w:jc w:val="center"/>
                   </w:pPr>
                   <w:r>
-                    <w:t xml:space="preserve">29.8</w:t>
+                    <w:t xml:space="preserve">53.6</w:t>
                   </w:r>
                 </w:p>
               </w:tc>
@@ -7183,7 +7216,7 @@
                     <w:jc w:val="center"/>
                   </w:pPr>
                   <w:r>
-                    <w:t xml:space="preserve">E11</w:t>
+                    <w:t xml:space="preserve">E2</w:t>
                   </w:r>
                 </w:p>
               </w:tc>
@@ -7196,7 +7229,7 @@
                     <w:jc w:val="center"/>
                   </w:pPr>
                   <w:r>
-                    <w:t xml:space="preserve">Commodity/process specialism</w:t>
+                    <w:t xml:space="preserve">Operational experience</w:t>
                   </w:r>
                 </w:p>
               </w:tc>
@@ -7209,7 +7242,7 @@
                     <w:jc w:val="center"/>
                   </w:pPr>
                   <w:r>
-                    <w:t xml:space="preserve">16</w:t>
+                    <w:t xml:space="preserve">22</w:t>
                   </w:r>
                 </w:p>
               </w:tc>
@@ -7222,7 +7255,7 @@
                     <w:jc w:val="center"/>
                   </w:pPr>
                   <w:r>
-                    <w:t xml:space="preserve">28.1</w:t>
+                    <w:t xml:space="preserve">39.3</w:t>
                   </w:r>
                 </w:p>
               </w:tc>
@@ -7237,7 +7270,7 @@
                     <w:jc w:val="center"/>
                   </w:pPr>
                   <w:r>
-                    <w:t xml:space="preserve">E2</w:t>
+                    <w:t xml:space="preserve">E3</w:t>
                   </w:r>
                 </w:p>
               </w:tc>
@@ -7250,7 +7283,7 @@
                     <w:jc w:val="center"/>
                   </w:pPr>
                   <w:r>
-                    <w:t xml:space="preserve">Operational experience</w:t>
+                    <w:t xml:space="preserve">Sector: Coal Surface</w:t>
                   </w:r>
                 </w:p>
               </w:tc>
@@ -7263,7 +7296,7 @@
                     <w:jc w:val="center"/>
                   </w:pPr>
                   <w:r>
-                    <w:t xml:space="preserve">16</w:t>
+                    <w:t xml:space="preserve">12</w:t>
                   </w:r>
                 </w:p>
               </w:tc>
@@ -7276,7 +7309,7 @@
                     <w:jc w:val="center"/>
                   </w:pPr>
                   <w:r>
-                    <w:t xml:space="preserve">28.1</w:t>
+                    <w:t xml:space="preserve">21.4</w:t>
                   </w:r>
                 </w:p>
               </w:tc>
@@ -7291,7 +7324,7 @@
                     <w:jc w:val="center"/>
                   </w:pPr>
                   <w:r>
-                    <w:t xml:space="preserve">E3</w:t>
+                    <w:t xml:space="preserve">E5</w:t>
                   </w:r>
                 </w:p>
               </w:tc>
@@ -7304,7 +7337,7 @@
                     <w:jc w:val="center"/>
                   </w:pPr>
                   <w:r>
-                    <w:t xml:space="preserve">Sector: Coal Surface</w:t>
+                    <w:t xml:space="preserve">Sector: Minerals</w:t>
                   </w:r>
                 </w:p>
               </w:tc>
@@ -7317,7 +7350,7 @@
                     <w:jc w:val="center"/>
                   </w:pPr>
                   <w:r>
-                    <w:t xml:space="preserve">16</w:t>
+                    <w:t xml:space="preserve">12</w:t>
                   </w:r>
                 </w:p>
               </w:tc>
@@ -7330,7 +7363,7 @@
                     <w:jc w:val="center"/>
                   </w:pPr>
                   <w:r>
-                    <w:t xml:space="preserve">28.1</w:t>
+                    <w:t xml:space="preserve">21.4</w:t>
                   </w:r>
                 </w:p>
               </w:tc>
@@ -7345,7 +7378,7 @@
                     <w:jc w:val="center"/>
                   </w:pPr>
                   <w:r>
-                    <w:t xml:space="preserve">E5</w:t>
+                    <w:t xml:space="preserve">E8</w:t>
                   </w:r>
                 </w:p>
               </w:tc>
@@ -7358,7 +7391,7 @@
                     <w:jc w:val="center"/>
                   </w:pPr>
                   <w:r>
-                    <w:t xml:space="preserve">Sector: Minerals</w:t>
+                    <w:t xml:space="preserve">Workforce context</w:t>
                   </w:r>
                 </w:p>
               </w:tc>
@@ -7371,7 +7404,7 @@
                     <w:jc w:val="center"/>
                   </w:pPr>
                   <w:r>
-                    <w:t xml:space="preserve">10</w:t>
+                    <w:t xml:space="preserve">12</w:t>
                   </w:r>
                 </w:p>
               </w:tc>
@@ -7384,7 +7417,7 @@
                     <w:jc w:val="center"/>
                   </w:pPr>
                   <w:r>
-                    <w:t xml:space="preserve">17.5</w:t>
+                    <w:t xml:space="preserve">21.4</w:t>
                   </w:r>
                 </w:p>
               </w:tc>
@@ -7399,7 +7432,7 @@
                     <w:jc w:val="center"/>
                   </w:pPr>
                   <w:r>
-                    <w:t xml:space="preserve">E8</w:t>
+                    <w:t xml:space="preserve">E11</w:t>
                   </w:r>
                 </w:p>
               </w:tc>
@@ -7412,7 +7445,7 @@
                     <w:jc w:val="center"/>
                   </w:pPr>
                   <w:r>
-                    <w:t xml:space="preserve">Workforce context</w:t>
+                    <w:t xml:space="preserve">Commodity/process specialism</w:t>
                   </w:r>
                 </w:p>
               </w:tc>
@@ -7425,7 +7458,7 @@
                     <w:jc w:val="center"/>
                   </w:pPr>
                   <w:r>
-                    <w:t xml:space="preserve">7</w:t>
+                    <w:t xml:space="preserve">10</w:t>
                   </w:r>
                 </w:p>
               </w:tc>
@@ -7438,7 +7471,7 @@
                     <w:jc w:val="center"/>
                   </w:pPr>
                   <w:r>
-                    <w:t xml:space="preserve">12.3</w:t>
+                    <w:t xml:space="preserve">17.9</w:t>
                   </w:r>
                 </w:p>
               </w:tc>
@@ -7453,7 +7486,7 @@
                     <w:jc w:val="center"/>
                   </w:pPr>
                   <w:r>
-                    <w:t xml:space="preserve">E6</w:t>
+                    <w:t xml:space="preserve">E10</w:t>
                   </w:r>
                 </w:p>
               </w:tc>
@@ -7466,7 +7499,7 @@
                     <w:jc w:val="center"/>
                   </w:pPr>
                   <w:r>
-                    <w:t xml:space="preserve">Sector: Quarry</w:t>
+                    <w:t xml:space="preserve">Industry breadth</w:t>
                   </w:r>
                 </w:p>
               </w:tc>
@@ -7479,7 +7512,7 @@
                     <w:jc w:val="center"/>
                   </w:pPr>
                   <w:r>
-                    <w:t xml:space="preserve">6</w:t>
+                    <w:t xml:space="preserve">8</w:t>
                   </w:r>
                 </w:p>
               </w:tc>
@@ -7492,7 +7525,7 @@
                     <w:jc w:val="center"/>
                   </w:pPr>
                   <w:r>
-                    <w:t xml:space="preserve">10.5</w:t>
+                    <w:t xml:space="preserve">14.3</w:t>
                   </w:r>
                 </w:p>
               </w:tc>
@@ -7507,7 +7540,7 @@
                     <w:jc w:val="center"/>
                   </w:pPr>
                   <w:r>
-                    <w:t xml:space="preserve">E10</w:t>
+                    <w:t xml:space="preserve">E6</w:t>
                   </w:r>
                 </w:p>
               </w:tc>
@@ -7520,7 +7553,7 @@
                     <w:jc w:val="center"/>
                   </w:pPr>
                   <w:r>
-                    <w:t xml:space="preserve">Industry breadth</w:t>
+                    <w:t xml:space="preserve">Sector: Quarry</w:t>
                   </w:r>
                 </w:p>
               </w:tc>
@@ -7533,7 +7566,7 @@
                     <w:jc w:val="center"/>
                   </w:pPr>
                   <w:r>
-                    <w:t xml:space="preserve">5</w:t>
+                    <w:t xml:space="preserve">6</w:t>
                   </w:r>
                 </w:p>
               </w:tc>
@@ -7546,7 +7579,7 @@
                     <w:jc w:val="center"/>
                   </w:pPr>
                   <w:r>
-                    <w:t xml:space="preserve">8.8</w:t>
+                    <w:t xml:space="preserve">10.7</w:t>
                   </w:r>
                 </w:p>
               </w:tc>
@@ -7587,7 +7620,7 @@
                     <w:jc w:val="center"/>
                   </w:pPr>
                   <w:r>
-                    <w:t xml:space="preserve">4</w:t>
+                    <w:t xml:space="preserve">5</w:t>
                   </w:r>
                 </w:p>
               </w:tc>
@@ -7600,7 +7633,7 @@
                     <w:jc w:val="center"/>
                   </w:pPr>
                   <w:r>
-                    <w:t xml:space="preserve">7</w:t>
+                    <w:t xml:space="preserve">8.9</w:t>
                   </w:r>
                 </w:p>
               </w:tc>
@@ -7615,7 +7648,7 @@
                     <w:jc w:val="center"/>
                   </w:pPr>
                   <w:r>
-                    <w:t xml:space="preserve">E4</w:t>
+                    <w:t xml:space="preserve">E13</w:t>
                   </w:r>
                 </w:p>
               </w:tc>
@@ -7628,7 +7661,7 @@
                     <w:jc w:val="center"/>
                   </w:pPr>
                   <w:r>
-                    <w:t xml:space="preserve">Sector: Coal UG</w:t>
+                    <w:t xml:space="preserve">Contractor mgmt</w:t>
                   </w:r>
                 </w:p>
               </w:tc>
@@ -7641,7 +7674,7 @@
                     <w:jc w:val="center"/>
                   </w:pPr>
                   <w:r>
-                    <w:t xml:space="preserve">3</w:t>
+                    <w:t xml:space="preserve">4</w:t>
                   </w:r>
                 </w:p>
               </w:tc>
@@ -7654,7 +7687,7 @@
                     <w:jc w:val="center"/>
                   </w:pPr>
                   <w:r>
-                    <w:t xml:space="preserve">5.3</w:t>
+                    <w:t xml:space="preserve">7.1</w:t>
                   </w:r>
                 </w:p>
               </w:tc>
@@ -7669,7 +7702,7 @@
                     <w:jc w:val="center"/>
                   </w:pPr>
                   <w:r>
-                    <w:t xml:space="preserve">E13</w:t>
+                    <w:t xml:space="preserve">E4</w:t>
                   </w:r>
                 </w:p>
               </w:tc>
@@ -7682,7 +7715,7 @@
                     <w:jc w:val="center"/>
                   </w:pPr>
                   <w:r>
-                    <w:t xml:space="preserve">Contractor mgmt</w:t>
+                    <w:t xml:space="preserve">Sector: Coal UG</w:t>
                   </w:r>
                 </w:p>
               </w:tc>
@@ -7695,7 +7728,7 @@
                     <w:jc w:val="center"/>
                   </w:pPr>
                   <w:r>
-                    <w:t xml:space="preserve">2</w:t>
+                    <w:t xml:space="preserve">3</w:t>
                   </w:r>
                 </w:p>
               </w:tc>
@@ -7708,7 +7741,7 @@
                     <w:jc w:val="center"/>
                   </w:pPr>
                   <w:r>
-                    <w:t xml:space="preserve">3.5</w:t>
+                    <w:t xml:space="preserve">5.4</w:t>
                   </w:r>
                 </w:p>
               </w:tc>
@@ -7749,7 +7782,7 @@
                     <w:jc w:val="center"/>
                   </w:pPr>
                   <w:r>
-                    <w:t xml:space="preserve">1</w:t>
+                    <w:t xml:space="preserve">2</w:t>
                   </w:r>
                 </w:p>
               </w:tc>
@@ -7762,7 +7795,7 @@
                     <w:jc w:val="center"/>
                   </w:pPr>
                   <w:r>
-                    <w:t xml:space="preserve">1.8</w:t>
+                    <w:t xml:space="preserve">3.6</w:t>
                   </w:r>
                 </w:p>
               </w:tc>
@@ -7818,7 +7851,7 @@
             <w:r>
               <w:drawing>
                 <wp:inline>
-                  <wp:extent cx="5073650" cy="2702530"/>
+                  <wp:extent cx="5073650" cy="3826377"/>
                   <wp:effectExtent b="0" l="0" r="0" t="0"/>
                   <wp:docPr descr="" title="" id="73" name="Picture"/>
                   <a:graphic>
@@ -7839,7 +7872,7 @@
                         <pic:spPr bwMode="auto">
                           <a:xfrm>
                             <a:off x="0" y="0"/>
-                            <a:ext cx="5073650" cy="2702530"/>
+                            <a:ext cx="5073650" cy="3826377"/>
                           </a:xfrm>
                           <a:prstGeom prst="rect">
                             <a:avLst/>
@@ -7868,7 +7901,7 @@
               <w:pStyle w:val="ImageCaption"/>
             </w:pPr>
             <w:r>
-              <w:t xml:space="preserve">Figure 9: Top experience codes across 57 JDs</w:t>
+              <w:t xml:space="preserve">Figure 9: Top experience codes across 56 JDs</w:t>
             </w:r>
           </w:p>
           <w:bookmarkEnd w:id="75"/>
@@ -7896,7 +7929,7 @@
         </w:numPr>
       </w:pPr>
       <w:r>
-        <w:t xml:space="preserve">E1 (years of supervisory experience) appears in 43 JDs (75%), the highest count of any code in the corpus. Quantified expectations range from 2 to 10 years, with 5 years a common minimum.</w:t>
+        <w:t xml:space="preserve">E1 (years of supervisory experience) appears in 46 JDs (82%), the highest count of any code in the corpus. Quantified expectations range from 2 to 10 years, with 5 years a common minimum.</w:t>
       </w:r>
     </w:p>
     <w:p>
@@ -7908,7 +7941,7 @@
         </w:numPr>
       </w:pPr>
       <w:r>
-        <w:t xml:space="preserve">E7 (equipment or operational specialism) appears in 17 JDs (29%).</w:t>
+        <w:t xml:space="preserve">E7 (equipment or operational specialism) appears in 30 JDs (54%).</w:t>
       </w:r>
     </w:p>
     <w:p>
@@ -7920,7 +7953,7 @@
         </w:numPr>
       </w:pPr>
       <w:r>
-        <w:t xml:space="preserve">E2 (years of operational or production experience) appears in 17 JDs (29%).</w:t>
+        <w:t xml:space="preserve">E2 (years of operational or production experience) appears in 22 JDs (39%).</w:t>
       </w:r>
     </w:p>
     <w:p>
@@ -7932,7 +7965,7 @@
         </w:numPr>
       </w:pPr>
       <w:r>
-        <w:t xml:space="preserve">E3 (Coal Surface sector experience) appears in 16 JDs (28%); E11 (commodity or process specialism) also in 16 JDs (28%).</w:t>
+        <w:t xml:space="preserve">E3 (Coal Surface sector experience), E5 (hard rock or minerals experience), and E8 (workforce context) are each named in 12 JDs (21%).</w:t>
       </w:r>
     </w:p>
     <w:p>
@@ -7944,7 +7977,7 @@
         </w:numPr>
       </w:pPr>
       <w:r>
-        <w:t xml:space="preserve">E5 (hard rock or minerals experience) appears in 10 JDs (17%).</w:t>
+        <w:t xml:space="preserve">E11 (commodity or process specialism) appears in 10 JDs (18%).</w:t>
       </w:r>
     </w:p>
     <w:p>
@@ -7956,7 +7989,31 @@
         </w:numPr>
       </w:pPr>
       <w:r>
-        <w:t xml:space="preserve">E9 (project delivery or shutdown experience) appears in 4 JDs (7%): BHP Lead Supervisor Shutdown, LMP Project, Projects Crew Supervisor, and South32 Cannington Mechanical Supervisor.</w:t>
+        <w:t xml:space="preserve">E10 (industry breadth beyond mining) appears in 8 JDs (14%); E6 (Quarry sector experience) in 6 (11%).</w:t>
+      </w:r>
+    </w:p>
+    <w:p>
+      <w:pPr>
+        <w:pStyle w:val="Compact"/>
+        <w:numPr>
+          <w:ilvl w:val="0"/>
+          <w:numId w:val="1009"/>
+        </w:numPr>
+      </w:pPr>
+      <w:r>
+        <w:t xml:space="preserve">E9 (project delivery or shutdown experience) appears in 5 JDs (9%): BHP Lead Supervisor Shutdown, LMP Project, Projects Crew Supervisor, Glencore MPS Mech, and South32 Cannington Mechanical Supervisor.</w:t>
+      </w:r>
+    </w:p>
+    <w:p>
+      <w:pPr>
+        <w:pStyle w:val="Compact"/>
+        <w:numPr>
+          <w:ilvl w:val="0"/>
+          <w:numId w:val="1009"/>
+        </w:numPr>
+      </w:pPr>
+      <w:r>
+        <w:t xml:space="preserve">E14 (multi-shift or continuous roster experience) is unnamed in the corpus despite many JDs operating continuous rosters; the code is retained in the codebook but had zero coded instances.</w:t>
       </w:r>
     </w:p>
     <w:tbl>
@@ -7996,7 +8053,7 @@
             <w:r>
               <w:drawing>
                 <wp:inline>
-                  <wp:extent cx="5372100" cy="3269614"/>
+                  <wp:extent cx="5372100" cy="4336851"/>
                   <wp:effectExtent b="0" l="0" r="0" t="0"/>
                   <wp:docPr descr="" title="" id="77" name="Picture"/>
                   <a:graphic>
@@ -8017,7 +8074,7 @@
                         <pic:spPr bwMode="auto">
                           <a:xfrm>
                             <a:off x="0" y="0"/>
-                            <a:ext cx="5372100" cy="3269614"/>
+                            <a:ext cx="5372100" cy="4336851"/>
                           </a:xfrm>
                           <a:prstGeom prst="rect">
                             <a:avLst/>
@@ -8210,114 +8267,6 @@
                     <w:jc w:val="center"/>
                   </w:pPr>
                   <w:r>
-                    <w:t xml:space="preserve">2</w:t>
-                  </w:r>
-                </w:p>
-              </w:tc>
-              <w:tc>
-                <w:tcPr/>
-                <w:p>
-                  <w:pPr>
-                    <w:pStyle w:val="Compact"/>
-                    <w:jc w:val="right"/>
-                    <w:jc w:val="center"/>
-                  </w:pPr>
-                  <w:r>
-                    <w:t xml:space="preserve">3.5</w:t>
-                  </w:r>
-                </w:p>
-              </w:tc>
-            </w:tr>
-            <w:tr>
-              <w:tc>
-                <w:tcPr/>
-                <w:p>
-                  <w:pPr>
-                    <w:pStyle w:val="Compact"/>
-                    <w:jc w:val="left"/>
-                    <w:jc w:val="center"/>
-                  </w:pPr>
-                  <w:r>
-                    <w:t xml:space="preserve">SP8</w:t>
-                  </w:r>
-                </w:p>
-              </w:tc>
-              <w:tc>
-                <w:tcPr/>
-                <w:p>
-                  <w:pPr>
-                    <w:pStyle w:val="Compact"/>
-                    <w:jc w:val="left"/>
-                    <w:jc w:val="center"/>
-                  </w:pPr>
-                  <w:r>
-                    <w:t xml:space="preserve">Statutory UG Shift Sup</w:t>
-                  </w:r>
-                </w:p>
-              </w:tc>
-              <w:tc>
-                <w:tcPr/>
-                <w:p>
-                  <w:pPr>
-                    <w:pStyle w:val="Compact"/>
-                    <w:jc w:val="right"/>
-                    <w:jc w:val="center"/>
-                  </w:pPr>
-                  <w:r>
-                    <w:t xml:space="preserve">1</w:t>
-                  </w:r>
-                </w:p>
-              </w:tc>
-              <w:tc>
-                <w:tcPr/>
-                <w:p>
-                  <w:pPr>
-                    <w:pStyle w:val="Compact"/>
-                    <w:jc w:val="right"/>
-                    <w:jc w:val="center"/>
-                  </w:pPr>
-                  <w:r>
-                    <w:t xml:space="preserve">1.8</w:t>
-                  </w:r>
-                </w:p>
-              </w:tc>
-            </w:tr>
-            <w:tr>
-              <w:tc>
-                <w:tcPr/>
-                <w:p>
-                  <w:pPr>
-                    <w:pStyle w:val="Compact"/>
-                    <w:jc w:val="left"/>
-                    <w:jc w:val="center"/>
-                  </w:pPr>
-                  <w:r>
-                    <w:t xml:space="preserve">SP9</w:t>
-                  </w:r>
-                </w:p>
-              </w:tc>
-              <w:tc>
-                <w:tcPr/>
-                <w:p>
-                  <w:pPr>
-                    <w:pStyle w:val="Compact"/>
-                    <w:jc w:val="left"/>
-                    <w:jc w:val="center"/>
-                  </w:pPr>
-                  <w:r>
-                    <w:t xml:space="preserve">Shotfirer position</w:t>
-                  </w:r>
-                </w:p>
-              </w:tc>
-              <w:tc>
-                <w:tcPr/>
-                <w:p>
-                  <w:pPr>
-                    <w:pStyle w:val="Compact"/>
-                    <w:jc w:val="right"/>
-                    <w:jc w:val="center"/>
-                  </w:pPr>
-                  <w:r>
                     <w:t xml:space="preserve">1</w:t>
                   </w:r>
                 </w:p>
@@ -8359,7 +8308,7 @@
         <w:pStyle w:val="BodyText"/>
       </w:pPr>
       <w:r>
-        <w:t xml:space="preserve">4 of 57 JDs (7%) explicitly appoint to a named statutory position:</w:t>
+        <w:t xml:space="preserve">1 of 56 JDs (2%) explicitly appoints to a named statutory position:</w:t>
       </w:r>
     </w:p>
     <w:p>
@@ -8371,7 +8320,7 @@
         </w:numPr>
       </w:pPr>
       <w:r>
-        <w:t xml:space="preserve">Foxleigh Mine (Mining Supervisor / OCE): appoints to</w:t>
+        <w:t xml:space="preserve">Golding OCE Kogan (Mining Supervisor, OCE Qualified): appoints to</w:t>
       </w:r>
       <w:r>
         <w:t xml:space="preserve"> </w:t>
@@ -8381,10 +8330,35 @@
           <w:b/>
           <w:bCs/>
         </w:rPr>
-        <w:t xml:space="preserve">OCE (SP2)</w:t>
+        <w:t xml:space="preserve">Open Cut Examiner (SP2)</w:t>
+      </w:r>
+      <w:r>
+        <w:t xml:space="preserve">. The JD says explicitly under Key Responsibilities:</w:t>
+      </w:r>
+      <w:r>
+        <w:t xml:space="preserve"> </w:t>
+      </w:r>
+      <w:r>
+        <w:t xml:space="preserve">“Exercise statutory duties as an Open Cut Examiner (OCE)”</w:t>
       </w:r>
       <w:r>
         <w:t xml:space="preserve">.</w:t>
+      </w:r>
+    </w:p>
+    <w:p>
+      <w:pPr>
+        <w:pStyle w:val="FirstParagraph"/>
+      </w:pPr>
+      <w:r>
+        <w:t xml:space="preserve">The remaining 55 JDs (98%) require statutory tickets (coded under Qualifications) without explicitly appointing the holder to a named statutory position.</w:t>
+      </w:r>
+    </w:p>
+    <w:p>
+      <w:pPr>
+        <w:pStyle w:val="BodyText"/>
+      </w:pPr>
+      <w:r>
+        <w:t xml:space="preserve">Several JDs come close to an SP appointment without crossing the explicit-naming bar that the coding rule requires:</w:t>
       </w:r>
     </w:p>
     <w:p>
@@ -8392,24 +8366,39 @@
         <w:pStyle w:val="Compact"/>
         <w:numPr>
           <w:ilvl w:val="0"/>
-          <w:numId w:val="1010"/>
+          <w:numId w:val="1011"/>
         </w:numPr>
       </w:pPr>
-      <w:r>
-        <w:t xml:space="preserve">Golding OCE Kogan (Mining Supervisor, OCE Qualified): appoints to</w:t>
-      </w:r>
-      <w:r>
-        <w:t xml:space="preserve"> </w:t>
-      </w:r>
       <w:r>
         <w:rPr>
           <w:b/>
           <w:bCs/>
         </w:rPr>
-        <w:t xml:space="preserve">OCE (SP2)</w:t>
-      </w:r>
-      <w:r>
-        <w:t xml:space="preserve">.</w:t>
+        <w:t xml:space="preserve">Foxleigh Mine</w:t>
+      </w:r>
+      <w:r>
+        <w:t xml:space="preserve"> </w:t>
+      </w:r>
+      <w:r>
+        <w:t xml:space="preserve">advertises a</w:t>
+      </w:r>
+      <w:r>
+        <w:t xml:space="preserve"> </w:t>
+      </w:r>
+      <w:r>
+        <w:t xml:space="preserve">“Mining Supervisor / OCE”</w:t>
+      </w:r>
+      <w:r>
+        <w:t xml:space="preserve"> </w:t>
+      </w:r>
+      <w:r>
+        <w:t xml:space="preserve">role but frames OCE in the body as a qualification requirement (</w:t>
+      </w:r>
+      <w:r>
+        <w:t xml:space="preserve">“Mining Supervisor with OCE qualifications”</w:t>
+      </w:r>
+      <w:r>
+        <w:t xml:space="preserve">) rather than an appointment.</w:t>
       </w:r>
     </w:p>
     <w:p>
@@ -8417,24 +8406,33 @@
         <w:pStyle w:val="Compact"/>
         <w:numPr>
           <w:ilvl w:val="0"/>
-          <w:numId w:val="1010"/>
+          <w:numId w:val="1011"/>
         </w:numPr>
       </w:pPr>
-      <w:r>
-        <w:t xml:space="preserve">Brightstar Resources (Shift Supervisor): appoints to</w:t>
-      </w:r>
-      <w:r>
-        <w:t xml:space="preserve"> </w:t>
-      </w:r>
       <w:r>
         <w:rPr>
           <w:b/>
           <w:bCs/>
         </w:rPr>
-        <w:t xml:space="preserve">Statutory Underground Shift Supervisor (SP8)</w:t>
-      </w:r>
-      <w:r>
-        <w:t xml:space="preserve">.</w:t>
+        <w:t xml:space="preserve">Brightstar Resources</w:t>
+      </w:r>
+      <w:r>
+        <w:t xml:space="preserve"> </w:t>
+      </w:r>
+      <w:r>
+        <w:t xml:space="preserve">requires a</w:t>
+      </w:r>
+      <w:r>
+        <w:t xml:space="preserve"> </w:t>
+      </w:r>
+      <w:r>
+        <w:t xml:space="preserve">“Statutory Underground Shift Supervisor ticket”</w:t>
+      </w:r>
+      <w:r>
+        <w:t xml:space="preserve"> </w:t>
+      </w:r>
+      <w:r>
+        <w:t xml:space="preserve">but does not name the holder as the statutory position.</w:t>
       </w:r>
     </w:p>
     <w:p>
@@ -8442,24 +8440,21 @@
         <w:pStyle w:val="Compact"/>
         <w:numPr>
           <w:ilvl w:val="0"/>
-          <w:numId w:val="1010"/>
+          <w:numId w:val="1011"/>
         </w:numPr>
       </w:pPr>
-      <w:r>
-        <w:t xml:space="preserve">Supervisor Blast Crew Goonyella Mine BMA: appoints to</w:t>
-      </w:r>
-      <w:r>
-        <w:t xml:space="preserve"> </w:t>
-      </w:r>
       <w:r>
         <w:rPr>
           <w:b/>
           <w:bCs/>
         </w:rPr>
-        <w:t xml:space="preserve">Shotfirer (SP9)</w:t>
-      </w:r>
-      <w:r>
-        <w:t xml:space="preserve">.</w:t>
+        <w:t xml:space="preserve">Supervisor Blast Crew Goonyella Mine BMA</w:t>
+      </w:r>
+      <w:r>
+        <w:t xml:space="preserve"> </w:t>
+      </w:r>
+      <w:r>
+        <w:t xml:space="preserve">requires Shotfirer accreditation but does not name the holder as the statutory Shotfirer.</w:t>
       </w:r>
     </w:p>
     <w:p>
@@ -8467,7 +8462,7 @@
         <w:pStyle w:val="FirstParagraph"/>
       </w:pPr>
       <w:r>
-        <w:t xml:space="preserve">The remaining 54 JDs (93%) require statutory tickets (coded under Qualifications) without explicitly appointing the holder to a named statutory position.</w:t>
+        <w:t xml:space="preserve">These three JDs are coded under Qualifications (Q4, Q5/Q-equivalent, Q20 respectively). The sparse SP coverage that results is partly a feature of the strict coding rule and partly a feature of the corpus: most QLD mining JDs treat statutory positions as ticket requirements rather than naming the appointment explicitly. This is a candidate for codebook v1.1 review.</w:t>
       </w:r>
     </w:p>
     <w:bookmarkEnd w:id="82"/>
@@ -8494,7 +8489,7 @@
         <w:pStyle w:val="FirstParagraph"/>
       </w:pPr>
       <w:r>
-        <w:t xml:space="preserve">51 of 57 JDs (89%) contain at least one of the four safety-related codes: D4 (safety leadership activities), D5 (statutory compliance), D6 (promote safety culture), or DP1 (safety-focused disposition). The 6 JDs without any of these safety codes are mostly thin source files where extracted text was limited.</w:t>
+        <w:t xml:space="preserve">53 of 56 JDs (95%) contain at least one of the four safety-related codes: D4 (safety leadership activities), D5 (statutory compliance), D6 (promote safety culture), or DP1 (safety-focused disposition). The 3 JDs without any of these safety codes are Development Supervisor (BHP/BMA, a Coal UG pathway role), Jennchem (a multi-role recruiting ad where the supervisor variant has only credentialing requirements), and Production Supervisor (Anglo Dawson, a thin SEEK scrape).</w:t>
       </w:r>
     </w:p>
     <w:bookmarkEnd w:id="83"/>
@@ -8504,7 +8499,21 @@
         <w:pStyle w:val="Heading2"/>
       </w:pPr>
       <w:r>
-        <w:t xml:space="preserve">10.2 The most-named codes by category</w:t>
+        <w:t>10.2 Required vs desirable rows</w:t>
+      </w:r>
+    </w:p>
+    <w:p>
+      <w:pPr/>
+      <w:r>
+        <w:t>Of the 966 coded rows, 526 (54%) are flagged required — meaning the JD treats the item as a hard requirement, either through explicit "must"/"essential" language or by listing it under a requirements-style heading (About You, Qualifications, What you'll bring, etc.) without softening. A further 33 (3%) are desirable, marked either by the bullet's own softening language ("preferred", "advantageous", "highly regarded") or by a softener section header ("It will also be beneficial if you have"). The remaining 407 (42%) are not_specified. These are all DUTY-category rows: they describe what the supervisor does in the role rather than what the candidate must bring, so they don't carry a requirement flag.</w:t>
+      </w:r>
+    </w:p>
+    <w:p>
+      <w:pPr>
+        <w:pStyle w:val="Heading2"/>
+      </w:pPr>
+      <w:r>
+        <w:t>10.3 The most-named codes by category</w:t>
       </w:r>
     </w:p>
     <w:p>
@@ -8662,7 +8671,7 @@
                     <w:jc w:val="center"/>
                   </w:pPr>
                   <w:r>
-                    <w:t xml:space="preserve">34</w:t>
+                    <w:t xml:space="preserve">39</w:t>
                   </w:r>
                 </w:p>
               </w:tc>
@@ -8675,7 +8684,7 @@
                     <w:jc w:val="center"/>
                   </w:pPr>
                   <w:r>
-                    <w:t xml:space="preserve">59.6</w:t>
+                    <w:t xml:space="preserve">69.6</w:t>
                   </w:r>
                 </w:p>
               </w:tc>
@@ -8716,7 +8725,7 @@
                     <w:jc w:val="center"/>
                   </w:pPr>
                   <w:r>
-                    <w:t xml:space="preserve">31</w:t>
+                    <w:t xml:space="preserve">28</w:t>
                   </w:r>
                 </w:p>
               </w:tc>
@@ -8729,7 +8738,7 @@
                     <w:jc w:val="center"/>
                   </w:pPr>
                   <w:r>
-                    <w:t xml:space="preserve">54.4</w:t>
+                    <w:t xml:space="preserve">50</w:t>
                   </w:r>
                 </w:p>
               </w:tc>
@@ -8783,7 +8792,7 @@
                     <w:jc w:val="center"/>
                   </w:pPr>
                   <w:r>
-                    <w:t xml:space="preserve">31.6</w:t>
+                    <w:t xml:space="preserve">32.1</w:t>
                   </w:r>
                 </w:p>
               </w:tc>
@@ -8824,7 +8833,7 @@
                     <w:jc w:val="center"/>
                   </w:pPr>
                   <w:r>
-                    <w:t xml:space="preserve">19</w:t>
+                    <w:t xml:space="preserve">18</w:t>
                   </w:r>
                 </w:p>
               </w:tc>
@@ -8837,7 +8846,7 @@
                     <w:jc w:val="center"/>
                   </w:pPr>
                   <w:r>
-                    <w:t xml:space="preserve">33.3</w:t>
+                    <w:t xml:space="preserve">32.1</w:t>
                   </w:r>
                 </w:p>
               </w:tc>
@@ -8878,7 +8887,7 @@
                     <w:jc w:val="center"/>
                   </w:pPr>
                   <w:r>
-                    <w:t xml:space="preserve">43</w:t>
+                    <w:t xml:space="preserve">46</w:t>
                   </w:r>
                 </w:p>
               </w:tc>
@@ -8891,7 +8900,7 @@
                     <w:jc w:val="center"/>
                   </w:pPr>
                   <w:r>
-                    <w:t xml:space="preserve">75.4</w:t>
+                    <w:t xml:space="preserve">82.1</w:t>
                   </w:r>
                 </w:p>
               </w:tc>
@@ -8932,7 +8941,7 @@
                     <w:jc w:val="center"/>
                   </w:pPr>
                   <w:r>
-                    <w:t xml:space="preserve">2</w:t>
+                    <w:t xml:space="preserve">1</w:t>
                   </w:r>
                 </w:p>
               </w:tc>
@@ -8945,7 +8954,7 @@
                     <w:jc w:val="center"/>
                   </w:pPr>
                   <w:r>
-                    <w:t xml:space="preserve">3.5</w:t>
+                    <w:t xml:space="preserve">1.8</w:t>
                   </w:r>
                 </w:p>
               </w:tc>
@@ -8963,7 +8972,7 @@
         <w:pStyle w:val="Heading2"/>
       </w:pPr>
       <w:r>
-        <w:t xml:space="preserve">10.3 Codes with sparse coverage</w:t>
+        <w:t>10.4 Codes with sparse coverage</w:t>
       </w:r>
     </w:p>
     <w:p>
@@ -8979,11 +8988,11 @@
         <w:pStyle w:val="Compact"/>
         <w:numPr>
           <w:ilvl w:val="0"/>
-          <w:numId w:val="1011"/>
+          <w:numId w:val="1012"/>
         </w:numPr>
       </w:pPr>
       <w:r>
-        <w:t xml:space="preserve">DP9 (coaching/mentoring orientation as trait): 2 JDs</w:t>
+        <w:t xml:space="preserve">DP4 (results-oriented): 3 JDs</w:t>
       </w:r>
     </w:p>
     <w:p>
@@ -8991,11 +9000,11 @@
         <w:pStyle w:val="Compact"/>
         <w:numPr>
           <w:ilvl w:val="0"/>
-          <w:numId w:val="1011"/>
+          <w:numId w:val="1012"/>
         </w:numPr>
       </w:pPr>
       <w:r>
-        <w:t xml:space="preserve">DP16 (inclusive leadership): 1 JD</w:t>
+        <w:t xml:space="preserve">DP8 (accountable / takes ownership): 2 JDs</w:t>
       </w:r>
     </w:p>
     <w:p>
@@ -9003,11 +9012,11 @@
         <w:pStyle w:val="Compact"/>
         <w:numPr>
           <w:ilvl w:val="0"/>
-          <w:numId w:val="1011"/>
+          <w:numId w:val="1012"/>
         </w:numPr>
       </w:pPr>
       <w:r>
-        <w:t xml:space="preserve">DP4 (results-oriented): 2 JDs</w:t>
+        <w:t xml:space="preserve">DP9 (coaching/mentoring orientation as trait): 1 JD</w:t>
       </w:r>
     </w:p>
     <w:p>
@@ -9015,11 +9024,11 @@
         <w:pStyle w:val="Compact"/>
         <w:numPr>
           <w:ilvl w:val="0"/>
-          <w:numId w:val="1011"/>
+          <w:numId w:val="1012"/>
         </w:numPr>
       </w:pPr>
       <w:r>
-        <w:t xml:space="preserve">K7 (continuous improvement methodology): 2 JDs</w:t>
+        <w:t xml:space="preserve">DP16 (inclusive leadership): 1 JD</w:t>
       </w:r>
     </w:p>
     <w:p>
@@ -9027,11 +9036,11 @@
         <w:pStyle w:val="Compact"/>
         <w:numPr>
           <w:ilvl w:val="0"/>
-          <w:numId w:val="1011"/>
+          <w:numId w:val="1012"/>
         </w:numPr>
       </w:pPr>
       <w:r>
-        <w:t xml:space="preserve">K3 (electrical legislation knowledge): 1 JD</w:t>
+        <w:t xml:space="preserve">K7 (continuous improvement methodology): 2 JDs</w:t>
       </w:r>
     </w:p>
     <w:p>
@@ -9039,11 +9048,11 @@
         <w:pStyle w:val="Compact"/>
         <w:numPr>
           <w:ilvl w:val="0"/>
-          <w:numId w:val="1011"/>
+          <w:numId w:val="1012"/>
         </w:numPr>
       </w:pPr>
       <w:r>
-        <w:t xml:space="preserve">K10 (product specifications): 1 JD</w:t>
+        <w:t xml:space="preserve">K3 (electrical legislation knowledge): 1 JD</w:t>
       </w:r>
     </w:p>
     <w:p>
@@ -9051,11 +9060,11 @@
         <w:pStyle w:val="Compact"/>
         <w:numPr>
           <w:ilvl w:val="0"/>
-          <w:numId w:val="1011"/>
+          <w:numId w:val="1012"/>
         </w:numPr>
       </w:pPr>
       <w:r>
-        <w:t xml:space="preserve">E12 (equipment brand specialism): 1 JD</w:t>
+        <w:t xml:space="preserve">K10 (product specifications): 1 JD</w:t>
       </w:r>
     </w:p>
     <w:p>
@@ -9063,11 +9072,11 @@
         <w:pStyle w:val="Compact"/>
         <w:numPr>
           <w:ilvl w:val="0"/>
-          <w:numId w:val="1011"/>
+          <w:numId w:val="1012"/>
         </w:numPr>
       </w:pPr>
       <w:r>
-        <w:t xml:space="preserve">E14 (multi-shift roster experience): 1 JD</w:t>
+        <w:t xml:space="preserve">E4 (Coal Underground sector experience): 3 JDs</w:t>
       </w:r>
     </w:p>
     <w:p>
@@ -9075,11 +9084,11 @@
         <w:pStyle w:val="Compact"/>
         <w:numPr>
           <w:ilvl w:val="0"/>
-          <w:numId w:val="1011"/>
+          <w:numId w:val="1012"/>
         </w:numPr>
       </w:pPr>
       <w:r>
-        <w:t xml:space="preserve">Q13 (White Card): 1 JD</w:t>
+        <w:t xml:space="preserve">E12 (equipment brand specialism): 2 JDs</w:t>
       </w:r>
     </w:p>
     <w:p>
@@ -9087,11 +9096,11 @@
         <w:pStyle w:val="Compact"/>
         <w:numPr>
           <w:ilvl w:val="0"/>
-          <w:numId w:val="1011"/>
+          <w:numId w:val="1012"/>
         </w:numPr>
       </w:pPr>
       <w:r>
-        <w:t xml:space="preserve">Q15 (Explosives Security Clearance): 1 JD</w:t>
+        <w:t xml:space="preserve">E14 (multi-shift roster experience): 0 JDs</w:t>
       </w:r>
     </w:p>
     <w:p>
@@ -9099,11 +9108,11 @@
         <w:pStyle w:val="Compact"/>
         <w:numPr>
           <w:ilvl w:val="0"/>
-          <w:numId w:val="1011"/>
+          <w:numId w:val="1012"/>
         </w:numPr>
       </w:pPr>
       <w:r>
-        <w:t xml:space="preserve">Q19 (Frontline Management certification): 1 JD</w:t>
+        <w:t xml:space="preserve">Q3 (Coal Underground supervisor competencies): 2 JDs</w:t>
       </w:r>
     </w:p>
     <w:p>
@@ -9111,11 +9120,11 @@
         <w:pStyle w:val="Compact"/>
         <w:numPr>
           <w:ilvl w:val="0"/>
-          <w:numId w:val="1011"/>
+          <w:numId w:val="1012"/>
         </w:numPr>
       </w:pPr>
       <w:r>
-        <w:t xml:space="preserve">Q20 (Shotfirer accreditation): 1 JD</w:t>
+        <w:t xml:space="preserve">Q13 (White Card): 1 JD</w:t>
       </w:r>
     </w:p>
     <w:p>
@@ -9123,11 +9132,11 @@
         <w:pStyle w:val="Compact"/>
         <w:numPr>
           <w:ilvl w:val="0"/>
-          <w:numId w:val="1011"/>
+          <w:numId w:val="1012"/>
         </w:numPr>
       </w:pPr>
       <w:r>
-        <w:t xml:space="preserve">SP8 (Statutory UG Shift Supervisor): 1 JD</w:t>
+        <w:t xml:space="preserve">Q14 (MSIC): 1 JD</w:t>
       </w:r>
     </w:p>
     <w:p>
@@ -9135,19 +9144,55 @@
         <w:pStyle w:val="Compact"/>
         <w:numPr>
           <w:ilvl w:val="0"/>
-          <w:numId w:val="1011"/>
+          <w:numId w:val="1012"/>
         </w:numPr>
       </w:pPr>
       <w:r>
-        <w:t xml:space="preserve">SP9 (Shotfirer position): 1 JD</w:t>
+        <w:t xml:space="preserve">Q15 (Explosives Security Clearance): 1 JD</w:t>
       </w:r>
     </w:p>
     <w:p>
       <w:pPr>
+        <w:pStyle w:val="Compact"/>
+        <w:numPr>
+          <w:ilvl w:val="0"/>
+          <w:numId w:val="1012"/>
+        </w:numPr>
+      </w:pPr>
+      <w:r>
+        <w:t xml:space="preserve">Q19 (Frontline Management certification): 1 JD</w:t>
+      </w:r>
+    </w:p>
+    <w:p>
+      <w:pPr>
+        <w:pStyle w:val="Compact"/>
+        <w:numPr>
+          <w:ilvl w:val="0"/>
+          <w:numId w:val="1012"/>
+        </w:numPr>
+      </w:pPr>
+      <w:r>
+        <w:t xml:space="preserve">Q20 (Shotfirer accreditation): 1 JD</w:t>
+      </w:r>
+    </w:p>
+    <w:p>
+      <w:pPr>
+        <w:pStyle w:val="Compact"/>
+        <w:numPr>
+          <w:ilvl w:val="0"/>
+          <w:numId w:val="1012"/>
+        </w:numPr>
+      </w:pPr>
+      <w:r>
+        <w:t xml:space="preserve">SP1, SP3-SP9: 0 JDs each (only SP2 has a coded instance)</w:t>
+      </w:r>
+    </w:p>
+    <w:p>
+      <w:pPr>
         <w:pStyle w:val="FirstParagraph"/>
       </w:pPr>
       <w:r>
-        <w:t xml:space="preserve">These codes are retained in the codebook for completeness but should be treated as illustrative rather than typical.</w:t>
+        <w:t xml:space="preserve">These codes are retained in the codebook for completeness but should be treated as illustrative rather than typical. The cluster of zero-coverage SP codes is a consequence of the strict appointment rule and is discussed in the Statutory positions section above.</w:t>
       </w:r>
     </w:p>
     <w:bookmarkEnd w:id="86"/>
@@ -9166,27 +9211,22 @@
         <w:pStyle w:val="FirstParagraph"/>
       </w:pPr>
       <w:r>
-        <w:t xml:space="preserve">The full codebook is available at</w:t>
-      </w:r>
-      <w:r>
-        <w:t xml:space="preserve"> </w:t>
-      </w:r>
+        <w:t>The full codebook is available at 3_codebook_v1.0.docx (in this review package). The 87 codes are organised as follows:</w:t>
+      </w:r>
+      <w:r/>
       <w:r>
         <w:rPr>
           <w:rStyle w:val="VerbatimChar"/>
         </w:rPr>
-        <w:t xml:space="preserve">analysis/codebook/codebook_v1.0.md</w:t>
-      </w:r>
-      <w:r>
-        <w:t xml:space="preserve">. The 87 codes are organised as follows:</w:t>
-      </w:r>
+      </w:r>
+      <w:r/>
     </w:p>
     <w:p>
       <w:pPr>
         <w:pStyle w:val="Compact"/>
         <w:numPr>
           <w:ilvl w:val="0"/>
-          <w:numId w:val="1012"/>
+          <w:numId w:val="1013"/>
         </w:numPr>
       </w:pPr>
       <w:r>
@@ -9208,7 +9248,7 @@
         <w:pStyle w:val="Compact"/>
         <w:numPr>
           <w:ilvl w:val="0"/>
-          <w:numId w:val="1012"/>
+          <w:numId w:val="1013"/>
         </w:numPr>
       </w:pPr>
       <w:r>
@@ -9230,7 +9270,7 @@
         <w:pStyle w:val="Compact"/>
         <w:numPr>
           <w:ilvl w:val="0"/>
-          <w:numId w:val="1012"/>
+          <w:numId w:val="1013"/>
         </w:numPr>
       </w:pPr>
       <w:r>
@@ -9252,7 +9292,7 @@
         <w:pStyle w:val="Compact"/>
         <w:numPr>
           <w:ilvl w:val="0"/>
-          <w:numId w:val="1012"/>
+          <w:numId w:val="1013"/>
         </w:numPr>
       </w:pPr>
       <w:r>
@@ -9274,7 +9314,7 @@
         <w:pStyle w:val="Compact"/>
         <w:numPr>
           <w:ilvl w:val="0"/>
-          <w:numId w:val="1012"/>
+          <w:numId w:val="1013"/>
         </w:numPr>
       </w:pPr>
       <w:r>
@@ -9296,7 +9336,7 @@
         <w:pStyle w:val="Compact"/>
         <w:numPr>
           <w:ilvl w:val="0"/>
-          <w:numId w:val="1012"/>
+          <w:numId w:val="1013"/>
         </w:numPr>
       </w:pPr>
       <w:r>
@@ -9328,35 +9368,38 @@
         <w:pStyle w:val="FirstParagraph"/>
       </w:pPr>
       <w:r>
-        <w:t xml:space="preserve">The full coding sheet is available at</w:t>
-      </w:r>
-      <w:r>
-        <w:t xml:space="preserve"> </w:t>
-      </w:r>
+        <w:t>The full coding sheet is available at 4_coding_sheet.xlsx (in this review package). Each row is one (JD, category, code, evidence) instance with sector, role type, required flag, and confidence. Total: 966 rows across 56 JDs. Every row’s evidence value is a verbatim substring of the source JD body.</w:t>
+      </w:r>
+      <w:r/>
       <w:r>
         <w:rPr>
           <w:rStyle w:val="VerbatimChar"/>
         </w:rPr>
-        <w:t xml:space="preserve">analysis/coded_data/coded_jds.csv</w:t>
-      </w:r>
-      <w:r>
-        <w:t xml:space="preserve">. Each row is one</w:t>
-      </w:r>
-      <w:r>
-        <w:t xml:space="preserve"> </w:t>
-      </w:r>
+      </w:r>
+      <w:r/>
+      <w:r/>
       <w:r>
         <w:rPr>
           <w:rStyle w:val="VerbatimChar"/>
         </w:rPr>
-        <w:t xml:space="preserve">(JD, category, code, evidence)</w:t>
-      </w:r>
-      <w:r>
-        <w:t xml:space="preserve"> </w:t>
-      </w:r>
-      <w:r>
-        <w:t xml:space="preserve">instance with sector, role type, required flag, and confidence. Total: 812 rows across 57 JDs.</w:t>
-      </w:r>
+      </w:r>
+      <w:r/>
+      <w:r/>
+      <w:r/>
+      <w:r>
+        <w:rPr>
+          <w:rStyle w:val="VerbatimChar"/>
+        </w:rPr>
+      </w:r>
+      <w:r/>
+      <w:r/>
+      <w:r/>
+      <w:r>
+        <w:rPr>
+          <w:rStyle w:val="VerbatimChar"/>
+        </w:rPr>
+      </w:r>
+      <w:r/>
     </w:p>
     <w:bookmarkEnd w:id="89"/>
     <w:sectPr>
@@ -9850,6 +9893,9 @@
     <w:abstractNumId w:val="991"/>
   </w:num>
   <w:num w:numId="1012">
+    <w:abstractNumId w:val="991"/>
+  </w:num>
+  <w:num w:numId="1013">
     <w:abstractNumId w:val="991"/>
   </w:num>
 </w:numbering>

</xml_diff>